<commit_message>
docs: adiciona relatorio academico em PDF e DOCX com capa oficial UNINTER e guia para avaliacao do professor
</commit_message>
<xml_diff>
--- a/docs/Relatorio_Academico_Gestao_Franquias.docx
+++ b/docs/Relatorio_Academico_Gestao_Franquias.docx
@@ -4,34 +4,72 @@
   <w:body>
     <w:p>
       <w:pPr>
-        <w:jc w:val="center"/>
+        <w:jc w:val="right"/>
       </w:pPr>
       <w:r>
         <w:rPr>
           <w:b/>
-          <w:color w:val="0E2B5C"/>
-          <w:sz w:val="28"/>
+          <w:color w:val="002D62"/>
+          <w:sz w:val="26"/>
         </w:rPr>
-        <w:t>CENTRO UNIVERSITÁRIO INTERNACIONAL UNINTER</w:t>
+        <w:t>ANO</w:t>
         <w:br/>
       </w:r>
       <w:r>
         <w:rPr>
-          <w:color w:val="6C757D"/>
-          <w:sz w:val="22"/>
+          <w:b/>
+          <w:color w:val="002D62"/>
+          <w:sz w:val="30"/>
         </w:rPr>
-        <w:t>CURSO SUPERIOR DE TECNOLOGIA EM ANÁLISE E DESENVOLVIMENTO DE SISTEMAS</w:t>
-        <w:br/>
-        <w:t>DISCIPLINA: DESENVOLVIMENTO WEB BACK-END</w:t>
-        <w:br/>
-        <w:t>ANO: 2026</w:t>
+        <w:t>2026</w:t>
       </w:r>
     </w:p>
     <w:p>
       <w:r>
         <w:br/>
-        <w:br/>
-        <w:br/>
+      </w:r>
+    </w:p>
+    <w:p>
+      <w:pPr>
+        <w:jc w:val="center"/>
+      </w:pPr>
+      <w:r>
+        <w:drawing>
+          <wp:inline xmlns:a="http://schemas.openxmlformats.org/drawingml/2006/main" xmlns:pic="http://schemas.openxmlformats.org/drawingml/2006/picture">
+            <wp:extent cx="2011680" cy="2010189"/>
+            <wp:docPr id="1" name="Picture 1"/>
+            <wp:cNvGraphicFramePr>
+              <a:graphicFrameLocks noChangeAspect="1"/>
+            </wp:cNvGraphicFramePr>
+            <a:graphic>
+              <a:graphicData uri="http://schemas.openxmlformats.org/drawingml/2006/picture">
+                <pic:pic>
+                  <pic:nvPicPr>
+                    <pic:cNvPr id="0" name="uninter_logo.png"/>
+                    <pic:cNvPicPr/>
+                  </pic:nvPicPr>
+                  <pic:blipFill>
+                    <a:blip r:embed="rId9"/>
+                    <a:stretch>
+                      <a:fillRect/>
+                    </a:stretch>
+                  </pic:blipFill>
+                  <pic:spPr>
+                    <a:xfrm>
+                      <a:off x="0" y="0"/>
+                      <a:ext cx="2011680" cy="2010189"/>
+                    </a:xfrm>
+                    <a:prstGeom prst="rect"/>
+                  </pic:spPr>
+                </pic:pic>
+              </a:graphicData>
+            </a:graphic>
+          </wp:inline>
+        </w:drawing>
+      </w:r>
+    </w:p>
+    <w:p>
+      <w:r>
         <w:br/>
       </w:r>
     </w:p>
@@ -42,27 +80,33 @@
       <w:r>
         <w:rPr>
           <w:b/>
-          <w:color w:val="0E2B5C"/>
-          <w:sz w:val="44"/>
+          <w:color w:val="EAA11F"/>
+          <w:sz w:val="48"/>
         </w:rPr>
-        <w:t>RELATÓRIO DO TRABALHO ACADÊMICO</w:t>
+        <w:t>Trabalho Acadêmico</w:t>
+        <w:br/>
         <w:br/>
       </w:r>
       <w:r>
         <w:rPr>
           <w:b/>
-          <w:color w:val="D48A0E"/>
-          <w:sz w:val="28"/>
+          <w:color w:val="EAA11F"/>
+          <w:sz w:val="32"/>
         </w:rPr>
-        <w:t>SISTEMA DE GESTÃO DE FRANQUIAS</w:t>
+        <w:t>Desenvolvimento Web Back-end</w:t>
         <w:br/>
-        <w:t>API REST EM C# E ASP.NET CORE COM ENTITY FRAMEWORK CORE</w:t>
+      </w:r>
+      <w:r>
+        <w:rPr>
+          <w:b/>
+          <w:color w:val="EAA11F"/>
+          <w:sz w:val="32"/>
+        </w:rPr>
+        <w:t>Sistema de Gestão de Franquias</w:t>
       </w:r>
     </w:p>
     <w:p>
       <w:r>
-        <w:br/>
-        <w:br/>
         <w:br/>
         <w:br/>
         <w:br/>
@@ -77,19 +121,38 @@
       <w:r>
         <w:rPr>
           <w:b/>
-          <w:color w:val="212529"/>
+          <w:color w:val="222222"/>
           <w:sz w:val="24"/>
         </w:rPr>
-        <w:t>Estudante: WALLACE F G SILVA</w:t>
+        <w:t>WALLACE F G SILVA   RU: 5146520</w:t>
         <w:br/>
-        <w:t>RU: 5146520</w:t>
+      </w:r>
+      <w:r>
+        <w:rPr>
+          <w:b/>
+          <w:color w:val="222222"/>
+          <w:sz w:val="24"/>
+        </w:rPr>
+        <w:t>Prof. Rodrigo da S. do Nascimento</w:t>
         <w:br/>
-        <w:t>Professor Orientador: Prof. Rodrigo da S. do Nascimento</w:t>
+      </w:r>
+    </w:p>
+    <w:p>
+      <w:r>
         <w:br/>
-        <w:t>Ambiente: C# 12 / .NET 8.0 Web API / SQLite</w:t>
         <w:br/>
-        <w:t>Data de Entrega: Setembro de 2026</w:t>
-        <w:br/>
+      </w:r>
+    </w:p>
+    <w:p>
+      <w:pPr>
+        <w:jc w:val="center"/>
+      </w:pPr>
+      <w:r>
+        <w:rPr>
+          <w:color w:val="646464"/>
+          <w:sz w:val="18"/>
+        </w:rPr>
+        <w:t>Desenvolvimento Back-end — Trabalho Acadêmico 2026</w:t>
       </w:r>
     </w:p>
     <w:p>
@@ -99,64 +162,15 @@
     </w:p>
     <w:p>
       <w:pPr>
-        <w:spacing w:before="360" w:after="120"/>
+        <w:spacing w:before="320" w:after="80"/>
       </w:pPr>
       <w:r>
         <w:rPr>
           <w:b/>
-          <w:color w:val="0E2B5C"/>
-          <w:sz w:val="30"/>
+          <w:color w:val="002D62"/>
+          <w:sz w:val="28"/>
         </w:rPr>
-        <w:t>1. Introdução e Descrição do Problema</w:t>
-      </w:r>
-    </w:p>
-    <w:p>
-      <w:pPr>
-        <w:spacing w:line="276" w:lineRule="auto" w:after="120"/>
-      </w:pPr>
-      <w:r>
-        <w:rPr>
-          <w:color w:val="212529"/>
-          <w:sz w:val="21"/>
-        </w:rPr>
-        <w:t>No modelo empresarial de franchising, a integridade operacional e a padronização de rotinas entre a franqueadora (matriz) e suas unidades franqueadas constituem o alicerce para a expansão sustentável da marca. Contudo, na ausência de uma plataforma digital centralizada, as franquias frequentemente operam de forma isolada, gerando dispersão de informações em planilhas eletrônicas, lentidão na comunicação e ausência de conciliação fiscal e financeira.</w:t>
-      </w:r>
-    </w:p>
-    <w:p>
-      <w:pPr>
-        <w:spacing w:line="276" w:lineRule="auto" w:after="120"/>
-      </w:pPr>
-      <w:r>
-        <w:rPr>
-          <w:color w:val="212529"/>
-          <w:sz w:val="21"/>
-        </w:rPr>
-        <w:t>Para solucionar este desafio corporativo, o presente trabalho acadêmico apresenta o desenvolvimento de uma API REST completa em C# com ASP.NET Core Web API e Entity Framework Core. A solução centraliza o cadastro das unidades e seus respectivos responsáveis, mantém o catálogo padronizado de produtos e serviços, rastreia fornecedores homologados, monitora estoques em tempo real impedindo saldos negativos, orquestra as vendas em balcão com baixa atômica, calcula automaticamente os royalties devidos por competência e fornece indicadores gerenciais detalhados para tomada de decisão estratégica pela diretoria da rede.</w:t>
-      </w:r>
-    </w:p>
-    <w:p>
-      <w:pPr>
-        <w:spacing w:before="360" w:after="120"/>
-      </w:pPr>
-      <w:r>
-        <w:rPr>
-          <w:b/>
-          <w:color w:val="0E2B5C"/>
-          <w:sz w:val="30"/>
-        </w:rPr>
-        <w:t>2. Arquitetura e Organização do Projeto</w:t>
-      </w:r>
-    </w:p>
-    <w:p>
-      <w:pPr>
-        <w:spacing w:line="276" w:lineRule="auto" w:after="120"/>
-      </w:pPr>
-      <w:r>
-        <w:rPr>
-          <w:color w:val="212529"/>
-          <w:sz w:val="21"/>
-        </w:rPr>
-        <w:t>O sistema adota uma arquitetura em camadas orientada a objetos, fundamentada no princípio da responsabilidade única (SRP) e inversão de controle (IoC) nativa do .NET 8:</w:t>
+        <w:t>Instruções de Submissão e Guia do Avaliador</w:t>
       </w:r>
     </w:p>
     <w:p>
@@ -167,15 +181,15 @@
       <w:r>
         <w:rPr>
           <w:b/>
-          <w:color w:val="0E2B5C"/>
+          <w:color w:val="002D62"/>
         </w:rPr>
-        <w:t xml:space="preserve">Controllers (Franquias.Api/Controllers): </w:t>
+        <w:t xml:space="preserve">Disciplina: </w:t>
       </w:r>
       <w:r>
         <w:rPr>
-          <w:color w:val="212529"/>
+          <w:color w:val="222222"/>
         </w:rPr>
-        <w:t>Exposição dos endpoints RESTful, validação de payload, autenticação e documentação OpenAPI/Swagger.</w:t>
+        <w:t>Desenvolvimento Web Back-end (UNINTER — 2026)</w:t>
       </w:r>
     </w:p>
     <w:p>
@@ -186,15 +200,15 @@
       <w:r>
         <w:rPr>
           <w:b/>
-          <w:color w:val="0E2B5C"/>
+          <w:color w:val="002D62"/>
         </w:rPr>
-        <w:t xml:space="preserve">Services (Franquias.Api/Services): </w:t>
+        <w:t xml:space="preserve">Estudante: </w:t>
       </w:r>
       <w:r>
         <w:rPr>
-          <w:color w:val="212529"/>
+          <w:color w:val="222222"/>
         </w:rPr>
-        <w:t>Camada de domínio e regras de negócio corporativas (cálculo de royalties, validação de unidades inativas, controle transacional de vendas e bloqueio de estoque negativo).</w:t>
+        <w:t>WALLACE F G SILVA — RU: 5146520</w:t>
       </w:r>
     </w:p>
     <w:p>
@@ -205,15 +219,15 @@
       <w:r>
         <w:rPr>
           <w:b/>
-          <w:color w:val="0E2B5C"/>
+          <w:color w:val="002D62"/>
         </w:rPr>
-        <w:t xml:space="preserve">Repositories (Franquias.Api/Repositories): </w:t>
+        <w:t xml:space="preserve">Professor Orientador: </w:t>
       </w:r>
       <w:r>
         <w:rPr>
-          <w:color w:val="212529"/>
+          <w:color w:val="222222"/>
         </w:rPr>
-        <w:t>Abstração de acesso a dados (Repository Pattern) utilizando LINQ otimizado e Entity Framework Core.</w:t>
+        <w:t>Prof. Rodrigo da S. do Nascimento</w:t>
       </w:r>
     </w:p>
     <w:p>
@@ -224,1245 +238,28 @@
       <w:r>
         <w:rPr>
           <w:b/>
-          <w:color w:val="0E2B5C"/>
+          <w:color w:val="002D62"/>
         </w:rPr>
-        <w:t xml:space="preserve">Data &amp; Migrations (Franquias.Api/Data): </w:t>
+        <w:t xml:space="preserve">Repositório Oficial no GitHub: </w:t>
       </w:r>
       <w:r>
         <w:rPr>
-          <w:color w:val="212529"/>
+          <w:color w:val="222222"/>
         </w:rPr>
-        <w:t>Mapeamento relacional via Fluent API no AppDbContext, histórico de Migrations e classe DbInitializer para seed completo.</w:t>
+        <w:t>https://github.com/wallace-pv/Trabalho_Academico_Desenvolvimento_Backend_Gestao_Franquias</w:t>
       </w:r>
     </w:p>
     <w:p>
       <w:pPr>
-        <w:pStyle w:val="ListBullet"/>
-        <w:spacing w:after="60"/>
+        <w:spacing w:before="200" w:after="60"/>
       </w:pPr>
       <w:r>
         <w:rPr>
           <w:b/>
-          <w:color w:val="0E2B5C"/>
+          <w:color w:val="EAA11F"/>
+          <w:sz w:val="22"/>
         </w:rPr>
-        <w:t xml:space="preserve">DTOs (Franquias.Api/DTOs): </w:t>
-      </w:r>
-      <w:r>
-        <w:rPr>
-          <w:color w:val="212529"/>
-        </w:rPr>
-        <w:t>Objetos de transferência que blindam o modelo interno e evitam a exposição de dados sensíveis.</w:t>
-      </w:r>
-    </w:p>
-    <w:p>
-      <w:pPr>
-        <w:pStyle w:val="ListBullet"/>
-        <w:spacing w:after="60"/>
-      </w:pPr>
-      <w:r>
-        <w:rPr>
-          <w:b/>
-          <w:color w:val="0E2B5C"/>
-        </w:rPr>
-        <w:t xml:space="preserve">Configurations (Franquias.Api/Configurations): </w:t>
-      </w:r>
-      <w:r>
-        <w:rPr>
-          <w:color w:val="212529"/>
-        </w:rPr>
-        <w:t>Injeção de dependência modular, autenticação JWT Bearer e Middleware global para captura e padronização de exceções HTTP.</w:t>
-      </w:r>
-    </w:p>
-    <w:p>
-      <w:pPr>
-        <w:spacing w:before="360" w:after="120"/>
-      </w:pPr>
-      <w:r>
-        <w:rPr>
-          <w:b/>
-          <w:color w:val="0E2B5C"/>
-          <w:sz w:val="30"/>
-        </w:rPr>
-        <w:t>3. Modelagem Relacional do Banco de Dados</w:t>
-      </w:r>
-    </w:p>
-    <w:p>
-      <w:pPr>
-        <w:spacing w:line="276" w:lineRule="auto" w:after="120"/>
-      </w:pPr>
-      <w:r>
-        <w:rPr>
-          <w:color w:val="212529"/>
-          <w:sz w:val="21"/>
-        </w:rPr>
-        <w:t>O modelo relacional foi estruturado para refletir a totalidade das operações da franquia. Foi adotado o SQLite com Entity Framework Core, garantindo conformidade com transações ACID, integridade referencial, chaves primárias e índices únicos, além de permitir a portabilidade total da aplicação sem exigir a instalação de instâncias externas de banco pelo professor avaliador.</w:t>
-      </w:r>
-    </w:p>
-    <w:tbl>
-      <w:tblPr>
-        <w:tblW w:type="auto" w:w="0"/>
-        <w:jc w:val="center"/>
-        <w:tblLook w:firstColumn="1" w:firstRow="1" w:lastColumn="0" w:lastRow="0" w:noHBand="0" w:noVBand="1" w:val="04A0"/>
-      </w:tblPr>
-      <w:tblGrid>
-        <w:gridCol w:w="3120"/>
-        <w:gridCol w:w="3120"/>
-        <w:gridCol w:w="3120"/>
-      </w:tblGrid>
-      <w:tr>
-        <w:tc>
-          <w:tcPr>
-            <w:tcW w:type="dxa" w:w="3120"/>
-            <w:shd w:fill="0E2B5C"/>
-          </w:tcPr>
-          <w:p>
-            <w:r>
-              <w:rPr>
-                <w:b/>
-                <w:color w:val="FFFFFF"/>
-              </w:rPr>
-              <w:t>Tabela / Entidade</w:t>
-            </w:r>
-          </w:p>
-        </w:tc>
-        <w:tc>
-          <w:tcPr>
-            <w:tcW w:type="dxa" w:w="3120"/>
-            <w:shd w:fill="0E2B5C"/>
-          </w:tcPr>
-          <w:p>
-            <w:r>
-              <w:rPr>
-                <w:b/>
-                <w:color w:val="FFFFFF"/>
-              </w:rPr>
-              <w:t>Chaves e Índices</w:t>
-            </w:r>
-          </w:p>
-        </w:tc>
-        <w:tc>
-          <w:tcPr>
-            <w:tcW w:type="dxa" w:w="3120"/>
-            <w:shd w:fill="0E2B5C"/>
-          </w:tcPr>
-          <w:p>
-            <w:r>
-              <w:rPr>
-                <w:b/>
-                <w:color w:val="FFFFFF"/>
-              </w:rPr>
-              <w:t>Papel no Sistema</w:t>
-            </w:r>
-          </w:p>
-        </w:tc>
-      </w:tr>
-      <w:tr>
-        <w:tc>
-          <w:tcPr>
-            <w:tcW w:type="dxa" w:w="3120"/>
-            <w:shd w:fill="F8F9FA"/>
-            <w:tcMar>
-              <w:top w:w="80" w:type="dxa"/>
-              <w:bottom w:w="80" w:type="dxa"/>
-              <w:left w:w="100" w:type="dxa"/>
-              <w:right w:w="100" w:type="dxa"/>
-            </w:tcMar>
-          </w:tcPr>
-          <w:p>
-            <w:pPr>
-              <w:spacing w:after="40"/>
-            </w:pPr>
-            <w:r>
-              <w:rPr>
-                <w:sz w:val="18"/>
-              </w:rPr>
-              <w:t>Franqueadoras</w:t>
-            </w:r>
-          </w:p>
-        </w:tc>
-        <w:tc>
-          <w:tcPr>
-            <w:tcW w:type="dxa" w:w="3120"/>
-            <w:shd w:fill="F8F9FA"/>
-            <w:tcMar>
-              <w:top w:w="80" w:type="dxa"/>
-              <w:bottom w:w="80" w:type="dxa"/>
-              <w:left w:w="100" w:type="dxa"/>
-              <w:right w:w="100" w:type="dxa"/>
-            </w:tcMar>
-          </w:tcPr>
-          <w:p>
-            <w:pPr>
-              <w:spacing w:after="40"/>
-            </w:pPr>
-            <w:r>
-              <w:rPr>
-                <w:sz w:val="18"/>
-              </w:rPr>
-              <w:t>PK: Id | Unique: CNPJ</w:t>
-            </w:r>
-          </w:p>
-        </w:tc>
-        <w:tc>
-          <w:tcPr>
-            <w:tcW w:type="dxa" w:w="3120"/>
-            <w:shd w:fill="F8F9FA"/>
-            <w:tcMar>
-              <w:top w:w="80" w:type="dxa"/>
-              <w:bottom w:w="80" w:type="dxa"/>
-              <w:left w:w="100" w:type="dxa"/>
-              <w:right w:w="100" w:type="dxa"/>
-            </w:tcMar>
-          </w:tcPr>
-          <w:p>
-            <w:pPr>
-              <w:spacing w:after="40"/>
-            </w:pPr>
-            <w:r>
-              <w:rPr>
-                <w:sz w:val="18"/>
-              </w:rPr>
-              <w:t>Dados da matriz da rede e percentual padrão de royalties.</w:t>
-            </w:r>
-          </w:p>
-        </w:tc>
-      </w:tr>
-      <w:tr>
-        <w:tc>
-          <w:tcPr>
-            <w:tcW w:type="dxa" w:w="3120"/>
-            <w:shd w:fill="FFFFFF"/>
-            <w:tcMar>
-              <w:top w:w="80" w:type="dxa"/>
-              <w:bottom w:w="80" w:type="dxa"/>
-              <w:left w:w="100" w:type="dxa"/>
-              <w:right w:w="100" w:type="dxa"/>
-            </w:tcMar>
-          </w:tcPr>
-          <w:p>
-            <w:pPr>
-              <w:spacing w:after="40"/>
-            </w:pPr>
-            <w:r>
-              <w:rPr>
-                <w:sz w:val="18"/>
-              </w:rPr>
-              <w:t>Responsaveis</w:t>
-            </w:r>
-          </w:p>
-        </w:tc>
-        <w:tc>
-          <w:tcPr>
-            <w:tcW w:type="dxa" w:w="3120"/>
-            <w:shd w:fill="FFFFFF"/>
-            <w:tcMar>
-              <w:top w:w="80" w:type="dxa"/>
-              <w:bottom w:w="80" w:type="dxa"/>
-              <w:left w:w="100" w:type="dxa"/>
-              <w:right w:w="100" w:type="dxa"/>
-            </w:tcMar>
-          </w:tcPr>
-          <w:p>
-            <w:pPr>
-              <w:spacing w:after="40"/>
-            </w:pPr>
-            <w:r>
-              <w:rPr>
-                <w:sz w:val="18"/>
-              </w:rPr>
-              <w:t>PK: Id</w:t>
-            </w:r>
-          </w:p>
-        </w:tc>
-        <w:tc>
-          <w:tcPr>
-            <w:tcW w:type="dxa" w:w="3120"/>
-            <w:shd w:fill="FFFFFF"/>
-            <w:tcMar>
-              <w:top w:w="80" w:type="dxa"/>
-              <w:bottom w:w="80" w:type="dxa"/>
-              <w:left w:w="100" w:type="dxa"/>
-              <w:right w:w="100" w:type="dxa"/>
-            </w:tcMar>
-          </w:tcPr>
-          <w:p>
-            <w:pPr>
-              <w:spacing w:after="40"/>
-            </w:pPr>
-            <w:r>
-              <w:rPr>
-                <w:sz w:val="18"/>
-              </w:rPr>
-              <w:t>Dados cadastrais e contato dos franqueados responsáveis legais.</w:t>
-            </w:r>
-          </w:p>
-        </w:tc>
-      </w:tr>
-      <w:tr>
-        <w:tc>
-          <w:tcPr>
-            <w:tcW w:type="dxa" w:w="3120"/>
-            <w:shd w:fill="F8F9FA"/>
-            <w:tcMar>
-              <w:top w:w="80" w:type="dxa"/>
-              <w:bottom w:w="80" w:type="dxa"/>
-              <w:left w:w="100" w:type="dxa"/>
-              <w:right w:w="100" w:type="dxa"/>
-            </w:tcMar>
-          </w:tcPr>
-          <w:p>
-            <w:pPr>
-              <w:spacing w:after="40"/>
-            </w:pPr>
-            <w:r>
-              <w:rPr>
-                <w:sz w:val="18"/>
-              </w:rPr>
-              <w:t>Unidades</w:t>
-            </w:r>
-          </w:p>
-        </w:tc>
-        <w:tc>
-          <w:tcPr>
-            <w:tcW w:type="dxa" w:w="3120"/>
-            <w:shd w:fill="F8F9FA"/>
-            <w:tcMar>
-              <w:top w:w="80" w:type="dxa"/>
-              <w:bottom w:w="80" w:type="dxa"/>
-              <w:left w:w="100" w:type="dxa"/>
-              <w:right w:w="100" w:type="dxa"/>
-            </w:tcMar>
-          </w:tcPr>
-          <w:p>
-            <w:pPr>
-              <w:spacing w:after="40"/>
-            </w:pPr>
-            <w:r>
-              <w:rPr>
-                <w:sz w:val="18"/>
-              </w:rPr>
-              <w:t>PK: Id | FK: FranqueadoraId, ResponsavelId | Unique: CNPJ</w:t>
-            </w:r>
-          </w:p>
-        </w:tc>
-        <w:tc>
-          <w:tcPr>
-            <w:tcW w:type="dxa" w:w="3120"/>
-            <w:shd w:fill="F8F9FA"/>
-            <w:tcMar>
-              <w:top w:w="80" w:type="dxa"/>
-              <w:bottom w:w="80" w:type="dxa"/>
-              <w:left w:w="100" w:type="dxa"/>
-              <w:right w:w="100" w:type="dxa"/>
-            </w:tcMar>
-          </w:tcPr>
-          <w:p>
-            <w:pPr>
-              <w:spacing w:after="40"/>
-            </w:pPr>
-            <w:r>
-              <w:rPr>
-                <w:sz w:val="18"/>
-              </w:rPr>
-              <w:t>Lojas físicas, endereços, situação (Ativa/Inativa) e alíquota de royalty.</w:t>
-            </w:r>
-          </w:p>
-        </w:tc>
-      </w:tr>
-      <w:tr>
-        <w:tc>
-          <w:tcPr>
-            <w:tcW w:type="dxa" w:w="3120"/>
-            <w:shd w:fill="FFFFFF"/>
-            <w:tcMar>
-              <w:top w:w="80" w:type="dxa"/>
-              <w:bottom w:w="80" w:type="dxa"/>
-              <w:left w:w="100" w:type="dxa"/>
-              <w:right w:w="100" w:type="dxa"/>
-            </w:tcMar>
-          </w:tcPr>
-          <w:p>
-            <w:pPr>
-              <w:spacing w:after="40"/>
-            </w:pPr>
-            <w:r>
-              <w:rPr>
-                <w:sz w:val="18"/>
-              </w:rPr>
-              <w:t>Usuarios</w:t>
-            </w:r>
-          </w:p>
-        </w:tc>
-        <w:tc>
-          <w:tcPr>
-            <w:tcW w:type="dxa" w:w="3120"/>
-            <w:shd w:fill="FFFFFF"/>
-            <w:tcMar>
-              <w:top w:w="80" w:type="dxa"/>
-              <w:bottom w:w="80" w:type="dxa"/>
-              <w:left w:w="100" w:type="dxa"/>
-              <w:right w:w="100" w:type="dxa"/>
-            </w:tcMar>
-          </w:tcPr>
-          <w:p>
-            <w:pPr>
-              <w:spacing w:after="40"/>
-            </w:pPr>
-            <w:r>
-              <w:rPr>
-                <w:sz w:val="18"/>
-              </w:rPr>
-              <w:t>PK: Id | FK: UnidadeId | Unique: Email</w:t>
-            </w:r>
-          </w:p>
-        </w:tc>
-        <w:tc>
-          <w:tcPr>
-            <w:tcW w:type="dxa" w:w="3120"/>
-            <w:shd w:fill="FFFFFF"/>
-            <w:tcMar>
-              <w:top w:w="80" w:type="dxa"/>
-              <w:bottom w:w="80" w:type="dxa"/>
-              <w:left w:w="100" w:type="dxa"/>
-              <w:right w:w="100" w:type="dxa"/>
-            </w:tcMar>
-          </w:tcPr>
-          <w:p>
-            <w:pPr>
-              <w:spacing w:after="40"/>
-            </w:pPr>
-            <w:r>
-              <w:rPr>
-                <w:sz w:val="18"/>
-              </w:rPr>
-              <w:t>Operadores, Gestores e Administradores com perfis e senha com hash BCrypt.</w:t>
-            </w:r>
-          </w:p>
-        </w:tc>
-      </w:tr>
-      <w:tr>
-        <w:tc>
-          <w:tcPr>
-            <w:tcW w:type="dxa" w:w="3120"/>
-            <w:shd w:fill="F8F9FA"/>
-            <w:tcMar>
-              <w:top w:w="80" w:type="dxa"/>
-              <w:bottom w:w="80" w:type="dxa"/>
-              <w:left w:w="100" w:type="dxa"/>
-              <w:right w:w="100" w:type="dxa"/>
-            </w:tcMar>
-          </w:tcPr>
-          <w:p>
-            <w:pPr>
-              <w:spacing w:after="40"/>
-            </w:pPr>
-            <w:r>
-              <w:rPr>
-                <w:sz w:val="18"/>
-              </w:rPr>
-              <w:t>Categorias</w:t>
-            </w:r>
-          </w:p>
-        </w:tc>
-        <w:tc>
-          <w:tcPr>
-            <w:tcW w:type="dxa" w:w="3120"/>
-            <w:shd w:fill="F8F9FA"/>
-            <w:tcMar>
-              <w:top w:w="80" w:type="dxa"/>
-              <w:bottom w:w="80" w:type="dxa"/>
-              <w:left w:w="100" w:type="dxa"/>
-              <w:right w:w="100" w:type="dxa"/>
-            </w:tcMar>
-          </w:tcPr>
-          <w:p>
-            <w:pPr>
-              <w:spacing w:after="40"/>
-            </w:pPr>
-            <w:r>
-              <w:rPr>
-                <w:sz w:val="18"/>
-              </w:rPr>
-              <w:t>PK: Id</w:t>
-            </w:r>
-          </w:p>
-        </w:tc>
-        <w:tc>
-          <w:tcPr>
-            <w:tcW w:type="dxa" w:w="3120"/>
-            <w:shd w:fill="F8F9FA"/>
-            <w:tcMar>
-              <w:top w:w="80" w:type="dxa"/>
-              <w:bottom w:w="80" w:type="dxa"/>
-              <w:left w:w="100" w:type="dxa"/>
-              <w:right w:w="100" w:type="dxa"/>
-            </w:tcMar>
-          </w:tcPr>
-          <w:p>
-            <w:pPr>
-              <w:spacing w:after="40"/>
-            </w:pPr>
-            <w:r>
-              <w:rPr>
-                <w:sz w:val="18"/>
-              </w:rPr>
-              <w:t>Categorização dos produtos e serviços padronizados.</w:t>
-            </w:r>
-          </w:p>
-        </w:tc>
-      </w:tr>
-      <w:tr>
-        <w:tc>
-          <w:tcPr>
-            <w:tcW w:type="dxa" w:w="3120"/>
-            <w:shd w:fill="FFFFFF"/>
-            <w:tcMar>
-              <w:top w:w="80" w:type="dxa"/>
-              <w:bottom w:w="80" w:type="dxa"/>
-              <w:left w:w="100" w:type="dxa"/>
-              <w:right w:w="100" w:type="dxa"/>
-            </w:tcMar>
-          </w:tcPr>
-          <w:p>
-            <w:pPr>
-              <w:spacing w:after="40"/>
-            </w:pPr>
-            <w:r>
-              <w:rPr>
-                <w:sz w:val="18"/>
-              </w:rPr>
-              <w:t>Fornecedores</w:t>
-            </w:r>
-          </w:p>
-        </w:tc>
-        <w:tc>
-          <w:tcPr>
-            <w:tcW w:type="dxa" w:w="3120"/>
-            <w:shd w:fill="FFFFFF"/>
-            <w:tcMar>
-              <w:top w:w="80" w:type="dxa"/>
-              <w:bottom w:w="80" w:type="dxa"/>
-              <w:left w:w="100" w:type="dxa"/>
-              <w:right w:w="100" w:type="dxa"/>
-            </w:tcMar>
-          </w:tcPr>
-          <w:p>
-            <w:pPr>
-              <w:spacing w:after="40"/>
-            </w:pPr>
-            <w:r>
-              <w:rPr>
-                <w:sz w:val="18"/>
-              </w:rPr>
-              <w:t>PK: Id | Unique: CNPJ</w:t>
-            </w:r>
-          </w:p>
-        </w:tc>
-        <w:tc>
-          <w:tcPr>
-            <w:tcW w:type="dxa" w:w="3120"/>
-            <w:shd w:fill="FFFFFF"/>
-            <w:tcMar>
-              <w:top w:w="80" w:type="dxa"/>
-              <w:bottom w:w="80" w:type="dxa"/>
-              <w:left w:w="100" w:type="dxa"/>
-              <w:right w:w="100" w:type="dxa"/>
-            </w:tcMar>
-          </w:tcPr>
-          <w:p>
-            <w:pPr>
-              <w:spacing w:after="40"/>
-            </w:pPr>
-            <w:r>
-              <w:rPr>
-                <w:sz w:val="18"/>
-              </w:rPr>
-              <w:t>Fornecedores homologados pela rede.</w:t>
-            </w:r>
-          </w:p>
-        </w:tc>
-      </w:tr>
-      <w:tr>
-        <w:tc>
-          <w:tcPr>
-            <w:tcW w:type="dxa" w:w="3120"/>
-            <w:shd w:fill="F8F9FA"/>
-            <w:tcMar>
-              <w:top w:w="80" w:type="dxa"/>
-              <w:bottom w:w="80" w:type="dxa"/>
-              <w:left w:w="100" w:type="dxa"/>
-              <w:right w:w="100" w:type="dxa"/>
-            </w:tcMar>
-          </w:tcPr>
-          <w:p>
-            <w:pPr>
-              <w:spacing w:after="40"/>
-            </w:pPr>
-            <w:r>
-              <w:rPr>
-                <w:sz w:val="18"/>
-              </w:rPr>
-              <w:t>Produtos</w:t>
-            </w:r>
-          </w:p>
-        </w:tc>
-        <w:tc>
-          <w:tcPr>
-            <w:tcW w:type="dxa" w:w="3120"/>
-            <w:shd w:fill="F8F9FA"/>
-            <w:tcMar>
-              <w:top w:w="80" w:type="dxa"/>
-              <w:bottom w:w="80" w:type="dxa"/>
-              <w:left w:w="100" w:type="dxa"/>
-              <w:right w:w="100" w:type="dxa"/>
-            </w:tcMar>
-          </w:tcPr>
-          <w:p>
-            <w:pPr>
-              <w:spacing w:after="40"/>
-            </w:pPr>
-            <w:r>
-              <w:rPr>
-                <w:sz w:val="18"/>
-              </w:rPr>
-              <w:t>PK: Id | FK: CategoriaId, FornecedorId | Unique: CodigoSKU</w:t>
-            </w:r>
-          </w:p>
-        </w:tc>
-        <w:tc>
-          <w:tcPr>
-            <w:tcW w:type="dxa" w:w="3120"/>
-            <w:shd w:fill="F8F9FA"/>
-            <w:tcMar>
-              <w:top w:w="80" w:type="dxa"/>
-              <w:bottom w:w="80" w:type="dxa"/>
-              <w:left w:w="100" w:type="dxa"/>
-              <w:right w:w="100" w:type="dxa"/>
-            </w:tcMar>
-          </w:tcPr>
-          <w:p>
-            <w:pPr>
-              <w:spacing w:after="40"/>
-            </w:pPr>
-            <w:r>
-              <w:rPr>
-                <w:sz w:val="18"/>
-              </w:rPr>
-              <w:t>Catálogo padrão de mercadorias e serviços com preço base e estoque mínimo.</w:t>
-            </w:r>
-          </w:p>
-        </w:tc>
-      </w:tr>
-      <w:tr>
-        <w:tc>
-          <w:tcPr>
-            <w:tcW w:type="dxa" w:w="3120"/>
-            <w:shd w:fill="FFFFFF"/>
-            <w:tcMar>
-              <w:top w:w="80" w:type="dxa"/>
-              <w:bottom w:w="80" w:type="dxa"/>
-              <w:left w:w="100" w:type="dxa"/>
-              <w:right w:w="100" w:type="dxa"/>
-            </w:tcMar>
-          </w:tcPr>
-          <w:p>
-            <w:pPr>
-              <w:spacing w:after="40"/>
-            </w:pPr>
-            <w:r>
-              <w:rPr>
-                <w:sz w:val="18"/>
-              </w:rPr>
-              <w:t>Estoques</w:t>
-            </w:r>
-          </w:p>
-        </w:tc>
-        <w:tc>
-          <w:tcPr>
-            <w:tcW w:type="dxa" w:w="3120"/>
-            <w:shd w:fill="FFFFFF"/>
-            <w:tcMar>
-              <w:top w:w="80" w:type="dxa"/>
-              <w:bottom w:w="80" w:type="dxa"/>
-              <w:left w:w="100" w:type="dxa"/>
-              <w:right w:w="100" w:type="dxa"/>
-            </w:tcMar>
-          </w:tcPr>
-          <w:p>
-            <w:pPr>
-              <w:spacing w:after="40"/>
-            </w:pPr>
-            <w:r>
-              <w:rPr>
-                <w:sz w:val="18"/>
-              </w:rPr>
-              <w:t>PK: Id | FK: UnidadeId, ProdutoId | Unique: (UnidadeId, ProdutoId)</w:t>
-            </w:r>
-          </w:p>
-        </w:tc>
-        <w:tc>
-          <w:tcPr>
-            <w:tcW w:type="dxa" w:w="3120"/>
-            <w:shd w:fill="FFFFFF"/>
-            <w:tcMar>
-              <w:top w:w="80" w:type="dxa"/>
-              <w:bottom w:w="80" w:type="dxa"/>
-              <w:left w:w="100" w:type="dxa"/>
-              <w:right w:w="100" w:type="dxa"/>
-            </w:tcMar>
-          </w:tcPr>
-          <w:p>
-            <w:pPr>
-              <w:spacing w:after="40"/>
-            </w:pPr>
-            <w:r>
-              <w:rPr>
-                <w:sz w:val="18"/>
-              </w:rPr>
-              <w:t>Saldo físico disponível por produto em cada unidade franqueada.</w:t>
-            </w:r>
-          </w:p>
-        </w:tc>
-      </w:tr>
-      <w:tr>
-        <w:tc>
-          <w:tcPr>
-            <w:tcW w:type="dxa" w:w="3120"/>
-            <w:shd w:fill="F8F9FA"/>
-            <w:tcMar>
-              <w:top w:w="80" w:type="dxa"/>
-              <w:bottom w:w="80" w:type="dxa"/>
-              <w:left w:w="100" w:type="dxa"/>
-              <w:right w:w="100" w:type="dxa"/>
-            </w:tcMar>
-          </w:tcPr>
-          <w:p>
-            <w:pPr>
-              <w:spacing w:after="40"/>
-            </w:pPr>
-            <w:r>
-              <w:rPr>
-                <w:sz w:val="18"/>
-              </w:rPr>
-              <w:t>MovimentacoesEstoque</w:t>
-            </w:r>
-          </w:p>
-        </w:tc>
-        <w:tc>
-          <w:tcPr>
-            <w:tcW w:type="dxa" w:w="3120"/>
-            <w:shd w:fill="F8F9FA"/>
-            <w:tcMar>
-              <w:top w:w="80" w:type="dxa"/>
-              <w:bottom w:w="80" w:type="dxa"/>
-              <w:left w:w="100" w:type="dxa"/>
-              <w:right w:w="100" w:type="dxa"/>
-            </w:tcMar>
-          </w:tcPr>
-          <w:p>
-            <w:pPr>
-              <w:spacing w:after="40"/>
-            </w:pPr>
-            <w:r>
-              <w:rPr>
-                <w:sz w:val="18"/>
-              </w:rPr>
-              <w:t>PK: Id | FK: UnidadeId, ProdutoId, UsuarioId</w:t>
-            </w:r>
-          </w:p>
-        </w:tc>
-        <w:tc>
-          <w:tcPr>
-            <w:tcW w:type="dxa" w:w="3120"/>
-            <w:shd w:fill="F8F9FA"/>
-            <w:tcMar>
-              <w:top w:w="80" w:type="dxa"/>
-              <w:bottom w:w="80" w:type="dxa"/>
-              <w:left w:w="100" w:type="dxa"/>
-              <w:right w:w="100" w:type="dxa"/>
-            </w:tcMar>
-          </w:tcPr>
-          <w:p>
-            <w:pPr>
-              <w:spacing w:after="40"/>
-            </w:pPr>
-            <w:r>
-              <w:rPr>
-                <w:sz w:val="18"/>
-              </w:rPr>
-              <w:t>Histórico de auditoria de todas as entradas, saídas e ajustes de saldo.</w:t>
-            </w:r>
-          </w:p>
-        </w:tc>
-      </w:tr>
-      <w:tr>
-        <w:tc>
-          <w:tcPr>
-            <w:tcW w:type="dxa" w:w="3120"/>
-            <w:shd w:fill="FFFFFF"/>
-            <w:tcMar>
-              <w:top w:w="80" w:type="dxa"/>
-              <w:bottom w:w="80" w:type="dxa"/>
-              <w:left w:w="100" w:type="dxa"/>
-              <w:right w:w="100" w:type="dxa"/>
-            </w:tcMar>
-          </w:tcPr>
-          <w:p>
-            <w:pPr>
-              <w:spacing w:after="40"/>
-            </w:pPr>
-            <w:r>
-              <w:rPr>
-                <w:sz w:val="18"/>
-              </w:rPr>
-              <w:t>Vendas</w:t>
-            </w:r>
-          </w:p>
-        </w:tc>
-        <w:tc>
-          <w:tcPr>
-            <w:tcW w:type="dxa" w:w="3120"/>
-            <w:shd w:fill="FFFFFF"/>
-            <w:tcMar>
-              <w:top w:w="80" w:type="dxa"/>
-              <w:bottom w:w="80" w:type="dxa"/>
-              <w:left w:w="100" w:type="dxa"/>
-              <w:right w:w="100" w:type="dxa"/>
-            </w:tcMar>
-          </w:tcPr>
-          <w:p>
-            <w:pPr>
-              <w:spacing w:after="40"/>
-            </w:pPr>
-            <w:r>
-              <w:rPr>
-                <w:sz w:val="18"/>
-              </w:rPr>
-              <w:t>PK: Id | FK: UnidadeId, UsuarioId | Unique: CodigoVenda</w:t>
-            </w:r>
-          </w:p>
-        </w:tc>
-        <w:tc>
-          <w:tcPr>
-            <w:tcW w:type="dxa" w:w="3120"/>
-            <w:shd w:fill="FFFFFF"/>
-            <w:tcMar>
-              <w:top w:w="80" w:type="dxa"/>
-              <w:bottom w:w="80" w:type="dxa"/>
-              <w:left w:w="100" w:type="dxa"/>
-              <w:right w:w="100" w:type="dxa"/>
-            </w:tcMar>
-          </w:tcPr>
-          <w:p>
-            <w:pPr>
-              <w:spacing w:after="40"/>
-            </w:pPr>
-            <w:r>
-              <w:rPr>
-                <w:sz w:val="18"/>
-              </w:rPr>
-              <w:t>Registro transacional do cupom de venda com total consolidado.</w:t>
-            </w:r>
-          </w:p>
-        </w:tc>
-      </w:tr>
-      <w:tr>
-        <w:tc>
-          <w:tcPr>
-            <w:tcW w:type="dxa" w:w="3120"/>
-            <w:shd w:fill="F8F9FA"/>
-            <w:tcMar>
-              <w:top w:w="80" w:type="dxa"/>
-              <w:bottom w:w="80" w:type="dxa"/>
-              <w:left w:w="100" w:type="dxa"/>
-              <w:right w:w="100" w:type="dxa"/>
-            </w:tcMar>
-          </w:tcPr>
-          <w:p>
-            <w:pPr>
-              <w:spacing w:after="40"/>
-            </w:pPr>
-            <w:r>
-              <w:rPr>
-                <w:sz w:val="18"/>
-              </w:rPr>
-              <w:t>ItensVenda</w:t>
-            </w:r>
-          </w:p>
-        </w:tc>
-        <w:tc>
-          <w:tcPr>
-            <w:tcW w:type="dxa" w:w="3120"/>
-            <w:shd w:fill="F8F9FA"/>
-            <w:tcMar>
-              <w:top w:w="80" w:type="dxa"/>
-              <w:bottom w:w="80" w:type="dxa"/>
-              <w:left w:w="100" w:type="dxa"/>
-              <w:right w:w="100" w:type="dxa"/>
-            </w:tcMar>
-          </w:tcPr>
-          <w:p>
-            <w:pPr>
-              <w:spacing w:after="40"/>
-            </w:pPr>
-            <w:r>
-              <w:rPr>
-                <w:sz w:val="18"/>
-              </w:rPr>
-              <w:t>PK: Id | FK: VendaId, ProdutoId</w:t>
-            </w:r>
-          </w:p>
-        </w:tc>
-        <w:tc>
-          <w:tcPr>
-            <w:tcW w:type="dxa" w:w="3120"/>
-            <w:shd w:fill="F8F9FA"/>
-            <w:tcMar>
-              <w:top w:w="80" w:type="dxa"/>
-              <w:bottom w:w="80" w:type="dxa"/>
-              <w:left w:w="100" w:type="dxa"/>
-              <w:right w:w="100" w:type="dxa"/>
-            </w:tcMar>
-          </w:tcPr>
-          <w:p>
-            <w:pPr>
-              <w:spacing w:after="40"/>
-            </w:pPr>
-            <w:r>
-              <w:rPr>
-                <w:sz w:val="18"/>
-              </w:rPr>
-              <w:t>Itens comercializados com snapshot de preço unitário e subtotal.</w:t>
-            </w:r>
-          </w:p>
-        </w:tc>
-      </w:tr>
-      <w:tr>
-        <w:tc>
-          <w:tcPr>
-            <w:tcW w:type="dxa" w:w="3120"/>
-            <w:shd w:fill="FFFFFF"/>
-            <w:tcMar>
-              <w:top w:w="80" w:type="dxa"/>
-              <w:bottom w:w="80" w:type="dxa"/>
-              <w:left w:w="100" w:type="dxa"/>
-              <w:right w:w="100" w:type="dxa"/>
-            </w:tcMar>
-          </w:tcPr>
-          <w:p>
-            <w:pPr>
-              <w:spacing w:after="40"/>
-            </w:pPr>
-            <w:r>
-              <w:rPr>
-                <w:sz w:val="18"/>
-              </w:rPr>
-              <w:t>Royalties</w:t>
-            </w:r>
-          </w:p>
-        </w:tc>
-        <w:tc>
-          <w:tcPr>
-            <w:tcW w:type="dxa" w:w="3120"/>
-            <w:shd w:fill="FFFFFF"/>
-            <w:tcMar>
-              <w:top w:w="80" w:type="dxa"/>
-              <w:bottom w:w="80" w:type="dxa"/>
-              <w:left w:w="100" w:type="dxa"/>
-              <w:right w:w="100" w:type="dxa"/>
-            </w:tcMar>
-          </w:tcPr>
-          <w:p>
-            <w:pPr>
-              <w:spacing w:after="40"/>
-            </w:pPr>
-            <w:r>
-              <w:rPr>
-                <w:sz w:val="18"/>
-              </w:rPr>
-              <w:t>PK: Id | FK: UnidadeId | Unique: (UnidadeId, Mes, Ano)</w:t>
-            </w:r>
-          </w:p>
-        </w:tc>
-        <w:tc>
-          <w:tcPr>
-            <w:tcW w:type="dxa" w:w="3120"/>
-            <w:shd w:fill="FFFFFF"/>
-            <w:tcMar>
-              <w:top w:w="80" w:type="dxa"/>
-              <w:bottom w:w="80" w:type="dxa"/>
-              <w:left w:w="100" w:type="dxa"/>
-              <w:right w:w="100" w:type="dxa"/>
-            </w:tcMar>
-          </w:tcPr>
-          <w:p>
-            <w:pPr>
-              <w:spacing w:after="40"/>
-            </w:pPr>
-            <w:r>
-              <w:rPr>
-                <w:sz w:val="18"/>
-              </w:rPr>
-              <w:t>Apuração financeira de royalties sobre faturamento bruto do período.</w:t>
-            </w:r>
-          </w:p>
-        </w:tc>
-      </w:tr>
-      <w:tr>
-        <w:tc>
-          <w:tcPr>
-            <w:tcW w:type="dxa" w:w="3120"/>
-            <w:shd w:fill="F8F9FA"/>
-            <w:tcMar>
-              <w:top w:w="80" w:type="dxa"/>
-              <w:bottom w:w="80" w:type="dxa"/>
-              <w:left w:w="100" w:type="dxa"/>
-              <w:right w:w="100" w:type="dxa"/>
-            </w:tcMar>
-          </w:tcPr>
-          <w:p>
-            <w:pPr>
-              <w:spacing w:after="40"/>
-            </w:pPr>
-            <w:r>
-              <w:rPr>
-                <w:sz w:val="18"/>
-              </w:rPr>
-              <w:t>Chamados</w:t>
-            </w:r>
-          </w:p>
-        </w:tc>
-        <w:tc>
-          <w:tcPr>
-            <w:tcW w:type="dxa" w:w="3120"/>
-            <w:shd w:fill="F8F9FA"/>
-            <w:tcMar>
-              <w:top w:w="80" w:type="dxa"/>
-              <w:bottom w:w="80" w:type="dxa"/>
-              <w:left w:w="100" w:type="dxa"/>
-              <w:right w:w="100" w:type="dxa"/>
-            </w:tcMar>
-          </w:tcPr>
-          <w:p>
-            <w:pPr>
-              <w:spacing w:after="40"/>
-            </w:pPr>
-            <w:r>
-              <w:rPr>
-                <w:sz w:val="18"/>
-              </w:rPr>
-              <w:t>PK: Id | FK: UnidadeId, UsuarioAberturaId</w:t>
-            </w:r>
-          </w:p>
-        </w:tc>
-        <w:tc>
-          <w:tcPr>
-            <w:tcW w:type="dxa" w:w="3120"/>
-            <w:shd w:fill="F8F9FA"/>
-            <w:tcMar>
-              <w:top w:w="80" w:type="dxa"/>
-              <w:bottom w:w="80" w:type="dxa"/>
-              <w:left w:w="100" w:type="dxa"/>
-              <w:right w:w="100" w:type="dxa"/>
-            </w:tcMar>
-          </w:tcPr>
-          <w:p>
-            <w:pPr>
-              <w:spacing w:after="40"/>
-            </w:pPr>
-            <w:r>
-              <w:rPr>
-                <w:sz w:val="18"/>
-              </w:rPr>
-              <w:t>Solicitações de suporte operacional e técnico entre franquia e matriz.</w:t>
-            </w:r>
-          </w:p>
-        </w:tc>
-      </w:tr>
-    </w:tbl>
-    <w:p/>
-    <w:p>
-      <w:pPr>
-        <w:spacing w:before="360" w:after="120"/>
-      </w:pPr>
-      <w:r>
-        <w:rPr>
-          <w:b/>
-          <w:color w:val="0E2B5C"/>
-          <w:sz w:val="30"/>
-        </w:rPr>
-        <w:t>4. Principais Regras de Negócio Implementadas</w:t>
-      </w:r>
-    </w:p>
-    <w:p>
-      <w:pPr>
-        <w:pStyle w:val="ListBullet"/>
-        <w:spacing w:after="80"/>
-      </w:pPr>
-      <w:r>
-        <w:rPr>
-          <w:b/>
-          <w:color w:val="0E2B5C"/>
-        </w:rPr>
-        <w:t xml:space="preserve">1. Unicidade de CNPJ de Unidades: </w:t>
-      </w:r>
-      <w:r>
-        <w:rPr>
-          <w:color w:val="212529"/>
-        </w:rPr>
-        <w:t>O sistema valida tanto em memória quanto no banco relacional (Index Unique) a unicidade de CNPJs de unidades e fornecedores, impedindo cadastros duplicados com retorno HTTP 400 Bad Request.</w:t>
-      </w:r>
-    </w:p>
-    <w:p>
-      <w:pPr>
-        <w:pStyle w:val="ListBullet"/>
-        <w:spacing w:after="80"/>
-      </w:pPr>
-      <w:r>
-        <w:rPr>
-          <w:b/>
-          <w:color w:val="0E2B5C"/>
-        </w:rPr>
-        <w:t xml:space="preserve">2. Bloqueio de Operações em Unidades Inativas: </w:t>
-      </w:r>
-      <w:r>
-        <w:rPr>
-          <w:color w:val="212529"/>
-        </w:rPr>
-        <w:t>Unidades franqueadas que estejam com situação Inativa têm seu acesso bloqueado para emissão de vendas (retorno HTTP 400 descritivo).</w:t>
-      </w:r>
-    </w:p>
-    <w:p>
-      <w:pPr>
-        <w:pStyle w:val="ListBullet"/>
-        <w:spacing w:after="80"/>
-      </w:pPr>
-      <w:r>
-        <w:rPr>
-          <w:b/>
-          <w:color w:val="0E2B5C"/>
-        </w:rPr>
-        <w:t xml:space="preserve">3. Impedimento Estrito de Saldo Negativo de Estoque: </w:t>
-      </w:r>
-      <w:r>
-        <w:rPr>
-          <w:color w:val="212529"/>
-        </w:rPr>
-        <w:t>Nenhuma movimentação de saída manual ou conclusão de venda pode deixar o saldo de estoque inferior a zero. Caso a quantidade demandada supere a disponível, a operação é interrompida.</w:t>
-      </w:r>
-    </w:p>
-    <w:p>
-      <w:pPr>
-        <w:pStyle w:val="ListBullet"/>
-        <w:spacing w:after="80"/>
-      </w:pPr>
-      <w:r>
-        <w:rPr>
-          <w:b/>
-          <w:color w:val="0E2B5C"/>
-        </w:rPr>
-        <w:t xml:space="preserve">4. Transação Atômica de Venda com Baixa de Estoque: </w:t>
-      </w:r>
-      <w:r>
-        <w:rPr>
-          <w:color w:val="212529"/>
-        </w:rPr>
-        <w:t>Ao registrar uma venda, o sistema abre uma transação via EF Core que persiste o cupom da venda, registra os itens e debita simultaneamente os saldos de estoque correspondentes.</w:t>
-      </w:r>
-    </w:p>
-    <w:p>
-      <w:pPr>
-        <w:pStyle w:val="ListBullet"/>
-        <w:spacing w:after="80"/>
-      </w:pPr>
-      <w:r>
-        <w:rPr>
-          <w:b/>
-          <w:color w:val="0E2B5C"/>
-        </w:rPr>
-        <w:t xml:space="preserve">5. Cálculo e Apuração Dinâmica de Royalties: </w:t>
-      </w:r>
-      <w:r>
-        <w:rPr>
-          <w:color w:val="212529"/>
-        </w:rPr>
-        <w:t>A rotina de apuração consolida todas as vendas com status Concluída dentro do mês e ano informados e aplica a alíquota contratual da unidade franqueada, registrando a data de vencimento para o dia 10 do mês subsequente.</w:t>
-      </w:r>
-    </w:p>
-    <w:p>
-      <w:pPr>
-        <w:pStyle w:val="ListBullet"/>
-        <w:spacing w:after="80"/>
-      </w:pPr>
-      <w:r>
-        <w:rPr>
-          <w:b/>
-          <w:color w:val="0E2B5C"/>
-        </w:rPr>
-        <w:t xml:space="preserve">6. Autenticação e Perfis de Acesso (RBAC): </w:t>
-      </w:r>
-      <w:r>
-        <w:rPr>
-          <w:color w:val="212529"/>
-        </w:rPr>
-        <w:t>Usuários autenticam-se com token JWT com validade de 8 horas. Endpoints críticos são protegidos por perfis: AdminFranqueadora (acesso amplo), GestorUnidade (gestão da sua unidade) e Operador (rotinas de PDV).</w:t>
-      </w:r>
-    </w:p>
-    <w:p>
-      <w:pPr>
-        <w:pStyle w:val="ListBullet"/>
-        <w:spacing w:after="80"/>
-      </w:pPr>
-      <w:r>
-        <w:rPr>
-          <w:b/>
-          <w:color w:val="0E2B5C"/>
-        </w:rPr>
-        <w:t xml:space="preserve">7. Tratamento Centralizado de Exceções: </w:t>
-      </w:r>
-      <w:r>
-        <w:rPr>
-          <w:color w:val="212529"/>
-        </w:rPr>
-        <w:t>O ExceptionHandlingMiddleware captura erros não tratados e formata retornos padronizados com os status HTTP adequados (400, 401, 403, 404 e 500).</w:t>
-      </w:r>
-    </w:p>
-    <w:p>
-      <w:pPr>
-        <w:spacing w:before="360" w:after="120"/>
-      </w:pPr>
-      <w:r>
-        <w:rPr>
-          <w:b/>
-          <w:color w:val="0E2B5C"/>
-          <w:sz w:val="30"/>
-        </w:rPr>
-        <w:t>5. Evidências de Execução dos Principais Endpoints</w:t>
-      </w:r>
-    </w:p>
-    <w:p>
-      <w:pPr>
-        <w:spacing w:line="276" w:lineRule="auto" w:after="120"/>
-      </w:pPr>
-      <w:r>
-        <w:rPr>
-          <w:color w:val="212529"/>
-          <w:sz w:val="21"/>
-        </w:rPr>
-        <w:t>A seguir são apresentadas as evidências reais de execução dos testes automatizados efetuados na API, demonstrando o comportamento correto de cada funcionalidade e regra de negócio exigida:</w:t>
-      </w:r>
-    </w:p>
-    <w:p>
-      <w:pPr>
-        <w:spacing w:before="240" w:after="80"/>
-      </w:pPr>
-      <w:r>
-        <w:rPr>
-          <w:b/>
-          <w:color w:val="D48A0E"/>
-          <w:sz w:val="24"/>
-        </w:rPr>
-        <w:t>Evidência 1: Autenticação com Emissão de Token JWT</w:t>
+        <w:t>Como Iniciar a API Localmente para Avaliação:</w:t>
       </w:r>
     </w:p>
     <w:tbl>
@@ -1480,10 +277,10 @@
             <w:tcW w:type="dxa" w:w="9360"/>
             <w:shd w:fill="F8F9FA"/>
             <w:tcMar>
-              <w:top w:w="140" w:type="dxa"/>
-              <w:bottom w:w="140" w:type="dxa"/>
-              <w:left w:w="180" w:type="dxa"/>
-              <w:right w:w="180" w:type="dxa"/>
+              <w:top w:w="120" w:type="dxa"/>
+              <w:bottom w:w="120" w:type="dxa"/>
+              <w:left w:w="160" w:type="dxa"/>
+              <w:right w:w="160" w:type="dxa"/>
             </w:tcMar>
           </w:tcPr>
           <w:p>
@@ -1493,37 +290,16 @@
             <w:r>
               <w:rPr>
                 <w:rFonts w:ascii="Consolas" w:hAnsi="Consolas"/>
-                <w:color w:val="282828"/>
-                <w:sz w:val="18"/>
+                <w:color w:val="1E1E1E"/>
+                <w:sz w:val="17"/>
               </w:rPr>
-              <w:t>POST /api/auth/login</w:t>
+              <w:t>1. git clone https://github.com/wallace-pv/Trabalho_Academico_Desenvolvimento_Backend_Gestao_Franquias.git</w:t>
               <w:br/>
-              <w:t>Request: {"email": "admin@franquias.com.br", "senha": "Admin@123"}</w:t>
+              <w:t>2. cd Trabalho_Academico_Desenvolvimento_Backend_Gestao_Franquias</w:t>
               <w:br/>
+              <w:t>3. dotnet run --project Franquias.Api</w:t>
               <w:br/>
-              <w:t>Response HTTP 200 OK:</w:t>
-              <w:br/>
-              <w:t>{</w:t>
-              <w:br/>
-              <w:t xml:space="preserve">  "token": "eyJhbGciOiJIUzI1NiIsInR5cCI6IkpXVCJ9...",</w:t>
-              <w:br/>
-              <w:t xml:space="preserve">  "expiracao": "2026-09-14T14:47:18Z",</w:t>
-              <w:br/>
-              <w:t xml:space="preserve">  "usuario": {</w:t>
-              <w:br/>
-              <w:t xml:space="preserve">    "id": 1,</w:t>
-              <w:br/>
-              <w:t xml:space="preserve">    "nome": "Wallace Silva (Administrador)",</w:t>
-              <w:br/>
-              <w:t xml:space="preserve">    "email": "admin@franquias.com.br",</w:t>
-              <w:br/>
-              <w:t xml:space="preserve">    "perfil": "AdminFranqueadora",</w:t>
-              <w:br/>
-              <w:t xml:space="preserve">    "ativo": true</w:t>
-              <w:br/>
-              <w:t xml:space="preserve">  }</w:t>
-              <w:br/>
-              <w:t>}</w:t>
+              <w:t>4. Acesse no navegador: http://localhost:5086/ (redireciona para o Swagger UI interativo)</w:t>
             </w:r>
           </w:p>
         </w:tc>
@@ -1532,580 +308,27 @@
     <w:p/>
     <w:p>
       <w:pPr>
-        <w:spacing w:before="240" w:after="80"/>
+        <w:spacing w:before="200" w:after="60"/>
       </w:pPr>
       <w:r>
         <w:rPr>
           <w:b/>
-          <w:color w:val="D48A0E"/>
-          <w:sz w:val="24"/>
+          <w:color w:val="EAA11F"/>
+          <w:sz w:val="22"/>
         </w:rPr>
-        <w:t>Evidência 2: Bloqueio de Unidade com CNPJ Duplicado</w:t>
-      </w:r>
-    </w:p>
-    <w:tbl>
-      <w:tblPr>
-        <w:tblW w:type="auto" w:w="0"/>
-        <w:jc w:val="center"/>
-        <w:tblLook w:firstColumn="1" w:firstRow="1" w:lastColumn="0" w:lastRow="0" w:noHBand="0" w:noVBand="1" w:val="04A0"/>
-      </w:tblPr>
-      <w:tblGrid>
-        <w:gridCol w:w="9360"/>
-      </w:tblGrid>
-      <w:tr>
-        <w:tc>
-          <w:tcPr>
-            <w:tcW w:type="dxa" w:w="9360"/>
-            <w:shd w:fill="F8F9FA"/>
-            <w:tcMar>
-              <w:top w:w="140" w:type="dxa"/>
-              <w:bottom w:w="140" w:type="dxa"/>
-              <w:left w:w="180" w:type="dxa"/>
-              <w:right w:w="180" w:type="dxa"/>
-            </w:tcMar>
-          </w:tcPr>
-          <w:p>
-            <w:pPr>
-              <w:spacing w:after="0" w:line="252" w:lineRule="auto"/>
-            </w:pPr>
-            <w:r>
-              <w:rPr>
-                <w:rFonts w:ascii="Consolas" w:hAnsi="Consolas"/>
-                <w:color w:val="282828"/>
-                <w:sz w:val="18"/>
-              </w:rPr>
-              <w:t>POST /api/unidades</w:t>
-              <w:br/>
-              <w:t>Payload com CNPJ já existente: 23.456.789/0001-01</w:t>
-              <w:br/>
-              <w:br/>
-              <w:t>Response HTTP 400 Bad Request:</w:t>
-              <w:br/>
-              <w:t>{</w:t>
-              <w:br/>
-              <w:t xml:space="preserve">  "sucesso": false,</w:t>
-              <w:br/>
-              <w:t xml:space="preserve">  "codigoStatus": 400,</w:t>
-              <w:br/>
-              <w:t xml:space="preserve">  "mensagem": "Já existe uma unidade franqueada cadastrada com o CNPJ '23.456.789/0001-01'.",</w:t>
-              <w:br/>
-              <w:t xml:space="preserve">  "dataHora": "2026-09-14T06:47:20Z"</w:t>
-              <w:br/>
-              <w:t>}</w:t>
-            </w:r>
-          </w:p>
-        </w:tc>
-      </w:tr>
-    </w:tbl>
-    <w:p/>
-    <w:p>
-      <w:pPr>
-        <w:spacing w:before="240" w:after="80"/>
-      </w:pPr>
-      <w:r>
-        <w:rPr>
-          <w:b/>
-          <w:color w:val="D48A0E"/>
-          <w:sz w:val="24"/>
-        </w:rPr>
-        <w:t>Evidência 3: Bloqueio de Venda para Unidade Inativa</w:t>
-      </w:r>
-    </w:p>
-    <w:tbl>
-      <w:tblPr>
-        <w:tblW w:type="auto" w:w="0"/>
-        <w:jc w:val="center"/>
-        <w:tblLook w:firstColumn="1" w:firstRow="1" w:lastColumn="0" w:lastRow="0" w:noHBand="0" w:noVBand="1" w:val="04A0"/>
-      </w:tblPr>
-      <w:tblGrid>
-        <w:gridCol w:w="9360"/>
-      </w:tblGrid>
-      <w:tr>
-        <w:tc>
-          <w:tcPr>
-            <w:tcW w:type="dxa" w:w="9360"/>
-            <w:shd w:fill="F8F9FA"/>
-            <w:tcMar>
-              <w:top w:w="140" w:type="dxa"/>
-              <w:bottom w:w="140" w:type="dxa"/>
-              <w:left w:w="180" w:type="dxa"/>
-              <w:right w:w="180" w:type="dxa"/>
-            </w:tcMar>
-          </w:tcPr>
-          <w:p>
-            <w:pPr>
-              <w:spacing w:after="0" w:line="252" w:lineRule="auto"/>
-            </w:pPr>
-            <w:r>
-              <w:rPr>
-                <w:rFonts w:ascii="Consolas" w:hAnsi="Consolas"/>
-                <w:color w:val="282828"/>
-                <w:sz w:val="18"/>
-              </w:rPr>
-              <w:t>POST /api/vendas</w:t>
-              <w:br/>
-              <w:t>Tentativa de registrar venda para a Unidade Barra RJ (Id 3, Situacao = Inativa)</w:t>
-              <w:br/>
-              <w:br/>
-              <w:t>Response HTTP 400 Bad Request:</w:t>
-              <w:br/>
-              <w:t>{</w:t>
-              <w:br/>
-              <w:t xml:space="preserve">  "sucesso": false,</w:t>
-              <w:br/>
-              <w:t xml:space="preserve">  "codigoStatus": 400,</w:t>
-              <w:br/>
-              <w:t xml:space="preserve">  "mensagem": "Não é permitido registrar vendas para a unidade 'Café Gourmet - Unidade Barra RJ' pois ela se encontra INATIVA.",</w:t>
-              <w:br/>
-              <w:t xml:space="preserve">  "dataHora": "2026-09-14T06:47:21Z"</w:t>
-              <w:br/>
-              <w:t>}</w:t>
-            </w:r>
-          </w:p>
-        </w:tc>
-      </w:tr>
-    </w:tbl>
-    <w:p/>
-    <w:p>
-      <w:pPr>
-        <w:spacing w:before="240" w:after="80"/>
-      </w:pPr>
-      <w:r>
-        <w:rPr>
-          <w:b/>
-          <w:color w:val="D48A0E"/>
-          <w:sz w:val="24"/>
-        </w:rPr>
-        <w:t>Evidência 4: Bloqueio de Movimentação que Resulte em Saldo Negativo</w:t>
-      </w:r>
-    </w:p>
-    <w:tbl>
-      <w:tblPr>
-        <w:tblW w:type="auto" w:w="0"/>
-        <w:jc w:val="center"/>
-        <w:tblLook w:firstColumn="1" w:firstRow="1" w:lastColumn="0" w:lastRow="0" w:noHBand="0" w:noVBand="1" w:val="04A0"/>
-      </w:tblPr>
-      <w:tblGrid>
-        <w:gridCol w:w="9360"/>
-      </w:tblGrid>
-      <w:tr>
-        <w:tc>
-          <w:tcPr>
-            <w:tcW w:type="dxa" w:w="9360"/>
-            <w:shd w:fill="F8F9FA"/>
-            <w:tcMar>
-              <w:top w:w="140" w:type="dxa"/>
-              <w:bottom w:w="140" w:type="dxa"/>
-              <w:left w:w="180" w:type="dxa"/>
-              <w:right w:w="180" w:type="dxa"/>
-            </w:tcMar>
-          </w:tcPr>
-          <w:p>
-            <w:pPr>
-              <w:spacing w:after="0" w:line="252" w:lineRule="auto"/>
-            </w:pPr>
-            <w:r>
-              <w:rPr>
-                <w:rFonts w:ascii="Consolas" w:hAnsi="Consolas"/>
-                <w:color w:val="282828"/>
-                <w:sz w:val="18"/>
-              </w:rPr>
-              <w:t>POST /api/estoques/movimentar</w:t>
-              <w:br/>
-              <w:t>Tentativa de SaidaVenda de 99.999 unidades do Café Espresso Blend</w:t>
-              <w:br/>
-              <w:br/>
-              <w:t>Response HTTP 400 Bad Request:</w:t>
-              <w:br/>
-              <w:t>{</w:t>
-              <w:br/>
-              <w:t xml:space="preserve">  "sucesso": false,</w:t>
-              <w:br/>
-              <w:t xml:space="preserve">  "codigoStatus": 400,</w:t>
-              <w:br/>
-              <w:t xml:space="preserve">  "mensagem": "Operação não permitida. O estoque do produto 'Café Espresso Blend Nobre 250g' na unidade 'Café Gourmet - Unidade Moema SP' não pode ficar negativo. Saldo disponível: 50, Quantidade solicitada: 99999.",</w:t>
-              <w:br/>
-              <w:t xml:space="preserve">  "dataHora": "2026-09-14T06:47:21Z"</w:t>
-              <w:br/>
-              <w:t>}</w:t>
-            </w:r>
-          </w:p>
-        </w:tc>
-      </w:tr>
-    </w:tbl>
-    <w:p/>
-    <w:p>
-      <w:pPr>
-        <w:spacing w:before="240" w:after="80"/>
-      </w:pPr>
-      <w:r>
-        <w:rPr>
-          <w:b/>
-          <w:color w:val="D48A0E"/>
-          <w:sz w:val="24"/>
-        </w:rPr>
-        <w:t>Evidência 5: Registro de Venda Válida com Atualização de Estoque</w:t>
-      </w:r>
-    </w:p>
-    <w:tbl>
-      <w:tblPr>
-        <w:tblW w:type="auto" w:w="0"/>
-        <w:jc w:val="center"/>
-        <w:tblLook w:firstColumn="1" w:firstRow="1" w:lastColumn="0" w:lastRow="0" w:noHBand="0" w:noVBand="1" w:val="04A0"/>
-      </w:tblPr>
-      <w:tblGrid>
-        <w:gridCol w:w="9360"/>
-      </w:tblGrid>
-      <w:tr>
-        <w:tc>
-          <w:tcPr>
-            <w:tcW w:type="dxa" w:w="9360"/>
-            <w:shd w:fill="F8F9FA"/>
-            <w:tcMar>
-              <w:top w:w="140" w:type="dxa"/>
-              <w:bottom w:w="140" w:type="dxa"/>
-              <w:left w:w="180" w:type="dxa"/>
-              <w:right w:w="180" w:type="dxa"/>
-            </w:tcMar>
-          </w:tcPr>
-          <w:p>
-            <w:pPr>
-              <w:spacing w:after="0" w:line="252" w:lineRule="auto"/>
-            </w:pPr>
-            <w:r>
-              <w:rPr>
-                <w:rFonts w:ascii="Consolas" w:hAnsi="Consolas"/>
-                <w:color w:val="282828"/>
-                <w:sz w:val="18"/>
-              </w:rPr>
-              <w:t>POST /api/vendas</w:t>
-              <w:br/>
-              <w:t>Payload com 2 cafés blend (R$ 38,50 cada) e 1 croissant (R$ 15,00)</w:t>
-              <w:br/>
-              <w:br/>
-              <w:t>Response HTTP 201 Created:</w:t>
-              <w:br/>
-              <w:t>{</w:t>
-              <w:br/>
-              <w:t xml:space="preserve">  "id": 4,</w:t>
-              <w:br/>
-              <w:t xml:space="preserve">  "codigoVenda": "VND-20260914-4BD8EE",</w:t>
-              <w:br/>
-              <w:t xml:space="preserve">  "unidadeNome": "Café Gourmet - Unidade Moema SP",</w:t>
-              <w:br/>
-              <w:t xml:space="preserve">  "usuarioNome": "Lucas Santos (Operador SP)",</w:t>
-              <w:br/>
-              <w:t xml:space="preserve">  "valorTotal": 92.00,</w:t>
-              <w:br/>
-              <w:t xml:space="preserve">  "status": "Concluida",</w:t>
-              <w:br/>
-              <w:t xml:space="preserve">  "itens": [</w:t>
-              <w:br/>
-              <w:t xml:space="preserve">    { "produtoNome": "Café Espresso Blend Nobre 250g", "quantidade": 2, "subtotal": 77.00 },</w:t>
-              <w:br/>
-              <w:t xml:space="preserve">    { "produtoNome": "Croissant Francês Folhado Tradicional", "quantidade": 1, "subtotal": 15.00 }</w:t>
-              <w:br/>
-              <w:t xml:space="preserve">  ]</w:t>
-              <w:br/>
-              <w:t>}</w:t>
-            </w:r>
-          </w:p>
-        </w:tc>
-      </w:tr>
-    </w:tbl>
-    <w:p/>
-    <w:p>
-      <w:pPr>
-        <w:spacing w:before="240" w:after="80"/>
-      </w:pPr>
-      <w:r>
-        <w:rPr>
-          <w:b/>
-          <w:color w:val="D48A0E"/>
-          <w:sz w:val="24"/>
-        </w:rPr>
-        <w:t>Evidência 6: Apuração de Royalties sobre o Faturamento da Unidade</w:t>
-      </w:r>
-    </w:p>
-    <w:tbl>
-      <w:tblPr>
-        <w:tblW w:type="auto" w:w="0"/>
-        <w:jc w:val="center"/>
-        <w:tblLook w:firstColumn="1" w:firstRow="1" w:lastColumn="0" w:lastRow="0" w:noHBand="0" w:noVBand="1" w:val="04A0"/>
-      </w:tblPr>
-      <w:tblGrid>
-        <w:gridCol w:w="9360"/>
-      </w:tblGrid>
-      <w:tr>
-        <w:tc>
-          <w:tcPr>
-            <w:tcW w:type="dxa" w:w="9360"/>
-            <w:shd w:fill="F8F9FA"/>
-            <w:tcMar>
-              <w:top w:w="140" w:type="dxa"/>
-              <w:bottom w:w="140" w:type="dxa"/>
-              <w:left w:w="180" w:type="dxa"/>
-              <w:right w:w="180" w:type="dxa"/>
-            </w:tcMar>
-          </w:tcPr>
-          <w:p>
-            <w:pPr>
-              <w:spacing w:after="0" w:line="252" w:lineRule="auto"/>
-            </w:pPr>
-            <w:r>
-              <w:rPr>
-                <w:rFonts w:ascii="Consolas" w:hAnsi="Consolas"/>
-                <w:color w:val="282828"/>
-                <w:sz w:val="18"/>
-              </w:rPr>
-              <w:t>POST /api/royalties/apurar</w:t>
-              <w:br/>
-              <w:t>Request: { "unidadeId": 1, "mesReferencia": 9, "anoReferencia": 2026 }</w:t>
-              <w:br/>
-              <w:br/>
-              <w:t>Response HTTP 200 OK:</w:t>
-              <w:br/>
-              <w:t>{</w:t>
-              <w:br/>
-              <w:t xml:space="preserve">  "id": 3,</w:t>
-              <w:br/>
-              <w:t xml:space="preserve">  "unidadeNome": "Café Gourmet - Unidade Moema SP",</w:t>
-              <w:br/>
-              <w:t xml:space="preserve">  "mesReferencia": 9,</w:t>
-              <w:br/>
-              <w:t xml:space="preserve">  "anoReferencia": 2026,</w:t>
-              <w:br/>
-              <w:t xml:space="preserve">  "faturamentoBase": 624.00,</w:t>
-              <w:br/>
-              <w:t xml:space="preserve">  "percentualCobrado": 5.0,</w:t>
-              <w:br/>
-              <w:t xml:space="preserve">  "valorRoyalty": 31.20,</w:t>
-              <w:br/>
-              <w:t xml:space="preserve">  "status": "Pendente",</w:t>
-              <w:br/>
-              <w:t xml:space="preserve">  "dataVencimento": "2026-10-10T00:00:00Z"</w:t>
-              <w:br/>
-              <w:t>}</w:t>
-            </w:r>
-          </w:p>
-        </w:tc>
-      </w:tr>
-    </w:tbl>
-    <w:p/>
-    <w:p>
-      <w:pPr>
-        <w:spacing w:before="240" w:after="80"/>
-      </w:pPr>
-      <w:r>
-        <w:rPr>
-          <w:b/>
-          <w:color w:val="D48A0E"/>
-          <w:sz w:val="24"/>
-        </w:rPr>
-        <w:t>Evidência 7: Indicadores Gerenciais e Ranking de Unidades por Faturamento</w:t>
-      </w:r>
-    </w:p>
-    <w:tbl>
-      <w:tblPr>
-        <w:tblW w:type="auto" w:w="0"/>
-        <w:jc w:val="center"/>
-        <w:tblLook w:firstColumn="1" w:firstRow="1" w:lastColumn="0" w:lastRow="0" w:noHBand="0" w:noVBand="1" w:val="04A0"/>
-      </w:tblPr>
-      <w:tblGrid>
-        <w:gridCol w:w="9360"/>
-      </w:tblGrid>
-      <w:tr>
-        <w:tc>
-          <w:tcPr>
-            <w:tcW w:type="dxa" w:w="9360"/>
-            <w:shd w:fill="F8F9FA"/>
-            <w:tcMar>
-              <w:top w:w="140" w:type="dxa"/>
-              <w:bottom w:w="140" w:type="dxa"/>
-              <w:left w:w="180" w:type="dxa"/>
-              <w:right w:w="180" w:type="dxa"/>
-            </w:tcMar>
-          </w:tcPr>
-          <w:p>
-            <w:pPr>
-              <w:spacing w:after="0" w:line="252" w:lineRule="auto"/>
-            </w:pPr>
-            <w:r>
-              <w:rPr>
-                <w:rFonts w:ascii="Consolas" w:hAnsi="Consolas"/>
-                <w:color w:val="282828"/>
-                <w:sz w:val="18"/>
-              </w:rPr>
-              <w:t>GET /api/relatorios/ranking-unidades</w:t>
-              <w:br/>
-              <w:br/>
-              <w:t>Response HTTP 200 OK:</w:t>
-              <w:br/>
-              <w:t>[</w:t>
-              <w:br/>
-              <w:t xml:space="preserve">  {</w:t>
-              <w:br/>
-              <w:t xml:space="preserve">    "posicao": 1,</w:t>
-              <w:br/>
-              <w:t xml:space="preserve">    "codigoUnidade": "FRANQ-SP01",</w:t>
-              <w:br/>
-              <w:t xml:space="preserve">    "nomeUnidade": "Café Gourmet - Unidade Moema SP",</w:t>
-              <w:br/>
-              <w:t xml:space="preserve">    "cidade": "São Paulo",</w:t>
-              <w:br/>
-              <w:t xml:space="preserve">    "totalVendas": 4,</w:t>
-              <w:br/>
-              <w:t xml:space="preserve">    "totalFaturado": 624.00</w:t>
-              <w:br/>
-              <w:t xml:space="preserve">  },</w:t>
-              <w:br/>
-              <w:t xml:space="preserve">  {</w:t>
-              <w:br/>
-              <w:t xml:space="preserve">    "posicao": 2,</w:t>
-              <w:br/>
-              <w:t xml:space="preserve">    "codigoUnidade": "FRANQ-PR01",</w:t>
-              <w:br/>
-              <w:t xml:space="preserve">    "nomeUnidade": "Café Gourmet - Unidade Batel Curitiba",</w:t>
-              <w:br/>
-              <w:t xml:space="preserve">    "cidade": "Curitiba",</w:t>
-              <w:br/>
-              <w:t xml:space="preserve">    "totalVendas": 1,</w:t>
-              <w:br/>
-              <w:t xml:space="preserve">    "totalFaturado": 115.50</w:t>
-              <w:br/>
-              <w:t xml:space="preserve">  }</w:t>
-              <w:br/>
-              <w:t>]</w:t>
-            </w:r>
-          </w:p>
-        </w:tc>
-      </w:tr>
-    </w:tbl>
-    <w:p/>
-    <w:p>
-      <w:pPr>
-        <w:spacing w:before="360" w:after="120"/>
-      </w:pPr>
-      <w:r>
-        <w:rPr>
-          <w:b/>
-          <w:color w:val="0E2B5C"/>
-          <w:sz w:val="30"/>
-        </w:rPr>
-        <w:t>6. Análise Crítica do Desenvolvimento</w:t>
+        <w:t>Usuários Pré-Cadastrados para Teste Imediato no Swagger:</w:t>
       </w:r>
     </w:p>
     <w:p>
       <w:pPr>
-        <w:spacing w:before="240" w:after="80"/>
+        <w:spacing w:line="276" w:lineRule="auto" w:after="100"/>
       </w:pPr>
       <w:r>
         <w:rPr>
-          <w:b/>
-          <w:color w:val="D48A0E"/>
-          <w:sz w:val="24"/>
+          <w:color w:val="222222"/>
+          <w:sz w:val="20"/>
         </w:rPr>
-        <w:t>6.1 Funcionalidades Implementadas e Destaques Técnicos</w:t>
-      </w:r>
-    </w:p>
-    <w:p>
-      <w:pPr>
-        <w:spacing w:line="276" w:lineRule="auto" w:after="120"/>
-      </w:pPr>
-      <w:r>
-        <w:rPr>
-          <w:color w:val="212529"/>
-          <w:sz w:val="21"/>
-        </w:rPr>
-        <w:t>Foram desenvolvidos com sucesso todos os 9 módulos funcionais exigidos na especificação: Autenticação JWT, Cadastro de Franqueadora e Unidades com validação de CNPJ, Catálogo de Produtos e Categorias, Controle de Fornecedores, Saldo e Movimentações de Estoque, Emissão de Vendas com integridade atômica, Apuração e Liquidação de Royalties, Abertura e Resolução de Chamados de Suporte, e Indicadores Analíticos com LINQ.</w:t>
-      </w:r>
-    </w:p>
-    <w:p>
-      <w:pPr>
-        <w:spacing w:before="240" w:after="80"/>
-      </w:pPr>
-      <w:r>
-        <w:rPr>
-          <w:b/>
-          <w:color w:val="D48A0E"/>
-          <w:sz w:val="24"/>
-        </w:rPr>
-        <w:t>6.2 Decisões Técnicas e Desafios Superados</w:t>
-      </w:r>
-    </w:p>
-    <w:p>
-      <w:pPr>
-        <w:spacing w:line="276" w:lineRule="auto" w:after="120"/>
-      </w:pPr>
-      <w:r>
-        <w:rPr>
-          <w:color w:val="212529"/>
-          <w:sz w:val="21"/>
-        </w:rPr>
-        <w:t>A decisão de utilizar o SQLite como banco relacional provou-se extremamente acertada para o contexto acadêmico, pois garante uma avaliação limpa e imediata pelo professor sem atritos de dependência de contêineres Docker ou serviços locais de terceiros. Durante a implementação dos relatórios gerenciais, superou-se a limitação do provider SQLite com o operador de agregação Sum em campos de ponto fixo (decimal), aplicando-se projeções otimizadas de colunas seguidas de cálculo em memória com LINQ to Objects.</w:t>
-      </w:r>
-    </w:p>
-    <w:p>
-      <w:pPr>
-        <w:spacing w:before="240" w:after="80"/>
-      </w:pPr>
-      <w:r>
-        <w:rPr>
-          <w:b/>
-          <w:color w:val="D48A0E"/>
-          <w:sz w:val="24"/>
-        </w:rPr>
-        <w:t>6.3 Limitações e Propostas de Evolução</w:t>
-      </w:r>
-    </w:p>
-    <w:p>
-      <w:pPr>
-        <w:spacing w:line="276" w:lineRule="auto" w:after="120"/>
-      </w:pPr>
-      <w:r>
-        <w:rPr>
-          <w:color w:val="212529"/>
-          <w:sz w:val="21"/>
-        </w:rPr>
-        <w:t>Como melhorias planejadas para versões futuras da plataforma corporativa, destacam-se: implementação de mensageria assíncrona (RabbitMQ ou Azure Service Bus) para notificação imediata de estoques críticos e chamados abertos aos gestores da franqueadora, e a integração de um gateway de pagamentos para geração automática de QR Codes PIX e boletos bancários nos lançamentos de royalties.</w:t>
-      </w:r>
-    </w:p>
-    <w:p>
-      <w:pPr>
-        <w:spacing w:before="360" w:after="120"/>
-      </w:pPr>
-      <w:r>
-        <w:rPr>
-          <w:b/>
-          <w:color w:val="0E2B5C"/>
-          <w:sz w:val="30"/>
-        </w:rPr>
-        <w:t>7. Conclusão e Dados de Acesso para Avaliação</w:t>
-      </w:r>
-    </w:p>
-    <w:p>
-      <w:pPr>
-        <w:spacing w:line="276" w:lineRule="auto" w:after="120"/>
-      </w:pPr>
-      <w:r>
-        <w:rPr>
-          <w:color w:val="212529"/>
-          <w:sz w:val="21"/>
-        </w:rPr>
-        <w:t>O projeto cumpre com rigor os requisitos acadêmicos da UNINTER, apresentando uma API REST corporativa moderna, fortemente tipada, segura, testada e completamente documentada via Swagger/OpenAPI.</w:t>
-      </w:r>
-    </w:p>
-    <w:p>
-      <w:pPr>
-        <w:spacing w:before="240" w:after="80"/>
-      </w:pPr>
-      <w:r>
-        <w:rPr>
-          <w:b/>
-          <w:color w:val="D48A0E"/>
-          <w:sz w:val="24"/>
-        </w:rPr>
-        <w:t>Resumo dos Usuários Pré-Cadastrados para Teste:</w:t>
+        <w:t>A aplicação executa o seed completo no primeiro arranque através do DbInitializer. Utilize as credenciais abaixo:</w:t>
       </w:r>
     </w:p>
     <w:tbl>
@@ -2124,7 +347,7 @@
         <w:tc>
           <w:tcPr>
             <w:tcW w:type="dxa" w:w="2340"/>
-            <w:shd w:fill="0E2B5C"/>
+            <w:shd w:fill="002D62"/>
           </w:tcPr>
           <w:p>
             <w:r>
@@ -2139,7 +362,7 @@
         <w:tc>
           <w:tcPr>
             <w:tcW w:type="dxa" w:w="2340"/>
-            <w:shd w:fill="0E2B5C"/>
+            <w:shd w:fill="002D62"/>
           </w:tcPr>
           <w:p>
             <w:r>
@@ -2154,7 +377,7 @@
         <w:tc>
           <w:tcPr>
             <w:tcW w:type="dxa" w:w="2340"/>
-            <w:shd w:fill="0E2B5C"/>
+            <w:shd w:fill="002D62"/>
           </w:tcPr>
           <w:p>
             <w:r>
@@ -2169,7 +392,7 @@
         <w:tc>
           <w:tcPr>
             <w:tcW w:type="dxa" w:w="2340"/>
-            <w:shd w:fill="0E2B5C"/>
+            <w:shd w:fill="002D62"/>
           </w:tcPr>
           <w:p>
             <w:r>
@@ -2188,19 +411,16 @@
             <w:tcW w:type="dxa" w:w="2340"/>
             <w:shd w:fill="F8F9FA"/>
             <w:tcMar>
-              <w:top w:w="80" w:type="dxa"/>
-              <w:bottom w:w="80" w:type="dxa"/>
-              <w:left w:w="100" w:type="dxa"/>
-              <w:right w:w="100" w:type="dxa"/>
+              <w:top w:w="60" w:type="dxa"/>
+              <w:bottom w:w="60" w:type="dxa"/>
+              <w:left w:w="80" w:type="dxa"/>
+              <w:right w:w="80" w:type="dxa"/>
             </w:tcMar>
           </w:tcPr>
           <w:p>
-            <w:pPr>
-              <w:spacing w:after="40"/>
-            </w:pPr>
             <w:r>
               <w:rPr>
-                <w:sz w:val="19"/>
+                <w:sz w:val="18"/>
               </w:rPr>
               <w:t>AdminFranqueadora</w:t>
             </w:r>
@@ -2211,19 +431,16 @@
             <w:tcW w:type="dxa" w:w="2340"/>
             <w:shd w:fill="F8F9FA"/>
             <w:tcMar>
-              <w:top w:w="80" w:type="dxa"/>
-              <w:bottom w:w="80" w:type="dxa"/>
-              <w:left w:w="100" w:type="dxa"/>
-              <w:right w:w="100" w:type="dxa"/>
+              <w:top w:w="60" w:type="dxa"/>
+              <w:bottom w:w="60" w:type="dxa"/>
+              <w:left w:w="80" w:type="dxa"/>
+              <w:right w:w="80" w:type="dxa"/>
             </w:tcMar>
           </w:tcPr>
           <w:p>
-            <w:pPr>
-              <w:spacing w:after="40"/>
-            </w:pPr>
             <w:r>
               <w:rPr>
-                <w:sz w:val="19"/>
+                <w:sz w:val="18"/>
               </w:rPr>
               <w:t>admin@franquias.com.br</w:t>
             </w:r>
@@ -2234,19 +451,16 @@
             <w:tcW w:type="dxa" w:w="2340"/>
             <w:shd w:fill="F8F9FA"/>
             <w:tcMar>
-              <w:top w:w="80" w:type="dxa"/>
-              <w:bottom w:w="80" w:type="dxa"/>
-              <w:left w:w="100" w:type="dxa"/>
-              <w:right w:w="100" w:type="dxa"/>
+              <w:top w:w="60" w:type="dxa"/>
+              <w:bottom w:w="60" w:type="dxa"/>
+              <w:left w:w="80" w:type="dxa"/>
+              <w:right w:w="80" w:type="dxa"/>
             </w:tcMar>
           </w:tcPr>
           <w:p>
-            <w:pPr>
-              <w:spacing w:after="40"/>
-            </w:pPr>
             <w:r>
               <w:rPr>
-                <w:sz w:val="19"/>
+                <w:sz w:val="18"/>
               </w:rPr>
               <w:t>Admin@123</w:t>
             </w:r>
@@ -2257,21 +471,18 @@
             <w:tcW w:type="dxa" w:w="2340"/>
             <w:shd w:fill="F8F9FA"/>
             <w:tcMar>
-              <w:top w:w="80" w:type="dxa"/>
-              <w:bottom w:w="80" w:type="dxa"/>
-              <w:left w:w="100" w:type="dxa"/>
-              <w:right w:w="100" w:type="dxa"/>
+              <w:top w:w="60" w:type="dxa"/>
+              <w:bottom w:w="60" w:type="dxa"/>
+              <w:left w:w="80" w:type="dxa"/>
+              <w:right w:w="80" w:type="dxa"/>
             </w:tcMar>
           </w:tcPr>
           <w:p>
-            <w:pPr>
-              <w:spacing w:after="40"/>
-            </w:pPr>
             <w:r>
               <w:rPr>
-                <w:sz w:val="19"/>
+                <w:sz w:val="18"/>
               </w:rPr>
-              <w:t>Acesso irrestrito a toda a rede</w:t>
+              <w:t>Matriz — Acesso total irrestrito</w:t>
             </w:r>
           </w:p>
         </w:tc>
@@ -2282,19 +493,16 @@
             <w:tcW w:type="dxa" w:w="2340"/>
             <w:shd w:fill="FFFFFF"/>
             <w:tcMar>
-              <w:top w:w="80" w:type="dxa"/>
-              <w:bottom w:w="80" w:type="dxa"/>
-              <w:left w:w="100" w:type="dxa"/>
-              <w:right w:w="100" w:type="dxa"/>
+              <w:top w:w="60" w:type="dxa"/>
+              <w:bottom w:w="60" w:type="dxa"/>
+              <w:left w:w="80" w:type="dxa"/>
+              <w:right w:w="80" w:type="dxa"/>
             </w:tcMar>
           </w:tcPr>
           <w:p>
-            <w:pPr>
-              <w:spacing w:after="40"/>
-            </w:pPr>
             <w:r>
               <w:rPr>
-                <w:sz w:val="19"/>
+                <w:sz w:val="18"/>
               </w:rPr>
               <w:t>GestorUnidade</w:t>
             </w:r>
@@ -2305,19 +513,16 @@
             <w:tcW w:type="dxa" w:w="2340"/>
             <w:shd w:fill="FFFFFF"/>
             <w:tcMar>
-              <w:top w:w="80" w:type="dxa"/>
-              <w:bottom w:w="80" w:type="dxa"/>
-              <w:left w:w="100" w:type="dxa"/>
-              <w:right w:w="100" w:type="dxa"/>
+              <w:top w:w="60" w:type="dxa"/>
+              <w:bottom w:w="60" w:type="dxa"/>
+              <w:left w:w="80" w:type="dxa"/>
+              <w:right w:w="80" w:type="dxa"/>
             </w:tcMar>
           </w:tcPr>
           <w:p>
-            <w:pPr>
-              <w:spacing w:after="40"/>
-            </w:pPr>
             <w:r>
               <w:rPr>
-                <w:sz w:val="19"/>
+                <w:sz w:val="18"/>
               </w:rPr>
               <w:t>gestor.sp@franquias.com.br</w:t>
             </w:r>
@@ -2328,19 +533,16 @@
             <w:tcW w:type="dxa" w:w="2340"/>
             <w:shd w:fill="FFFFFF"/>
             <w:tcMar>
-              <w:top w:w="80" w:type="dxa"/>
-              <w:bottom w:w="80" w:type="dxa"/>
-              <w:left w:w="100" w:type="dxa"/>
-              <w:right w:w="100" w:type="dxa"/>
+              <w:top w:w="60" w:type="dxa"/>
+              <w:bottom w:w="60" w:type="dxa"/>
+              <w:left w:w="80" w:type="dxa"/>
+              <w:right w:w="80" w:type="dxa"/>
             </w:tcMar>
           </w:tcPr>
           <w:p>
-            <w:pPr>
-              <w:spacing w:after="40"/>
-            </w:pPr>
             <w:r>
               <w:rPr>
-                <w:sz w:val="19"/>
+                <w:sz w:val="18"/>
               </w:rPr>
               <w:t>Gestor@123</w:t>
             </w:r>
@@ -2351,21 +553,18 @@
             <w:tcW w:type="dxa" w:w="2340"/>
             <w:shd w:fill="FFFFFF"/>
             <w:tcMar>
-              <w:top w:w="80" w:type="dxa"/>
-              <w:bottom w:w="80" w:type="dxa"/>
-              <w:left w:w="100" w:type="dxa"/>
-              <w:right w:w="100" w:type="dxa"/>
+              <w:top w:w="60" w:type="dxa"/>
+              <w:bottom w:w="60" w:type="dxa"/>
+              <w:left w:w="80" w:type="dxa"/>
+              <w:right w:w="80" w:type="dxa"/>
             </w:tcMar>
           </w:tcPr>
           <w:p>
-            <w:pPr>
-              <w:spacing w:after="40"/>
-            </w:pPr>
             <w:r>
               <w:rPr>
-                <w:sz w:val="19"/>
+                <w:sz w:val="18"/>
               </w:rPr>
-              <w:t>Unidade Moema SP</w:t>
+              <w:t>Gestão Unidade Moema SP</w:t>
             </w:r>
           </w:p>
         </w:tc>
@@ -2376,19 +575,16 @@
             <w:tcW w:type="dxa" w:w="2340"/>
             <w:shd w:fill="F8F9FA"/>
             <w:tcMar>
-              <w:top w:w="80" w:type="dxa"/>
-              <w:bottom w:w="80" w:type="dxa"/>
-              <w:left w:w="100" w:type="dxa"/>
-              <w:right w:w="100" w:type="dxa"/>
+              <w:top w:w="60" w:type="dxa"/>
+              <w:bottom w:w="60" w:type="dxa"/>
+              <w:left w:w="80" w:type="dxa"/>
+              <w:right w:w="80" w:type="dxa"/>
             </w:tcMar>
           </w:tcPr>
           <w:p>
-            <w:pPr>
-              <w:spacing w:after="40"/>
-            </w:pPr>
             <w:r>
               <w:rPr>
-                <w:sz w:val="19"/>
+                <w:sz w:val="18"/>
               </w:rPr>
               <w:t>Operador</w:t>
             </w:r>
@@ -2399,19 +595,16 @@
             <w:tcW w:type="dxa" w:w="2340"/>
             <w:shd w:fill="F8F9FA"/>
             <w:tcMar>
-              <w:top w:w="80" w:type="dxa"/>
-              <w:bottom w:w="80" w:type="dxa"/>
-              <w:left w:w="100" w:type="dxa"/>
-              <w:right w:w="100" w:type="dxa"/>
+              <w:top w:w="60" w:type="dxa"/>
+              <w:bottom w:w="60" w:type="dxa"/>
+              <w:left w:w="80" w:type="dxa"/>
+              <w:right w:w="80" w:type="dxa"/>
             </w:tcMar>
           </w:tcPr>
           <w:p>
-            <w:pPr>
-              <w:spacing w:after="40"/>
-            </w:pPr>
             <w:r>
               <w:rPr>
-                <w:sz w:val="19"/>
+                <w:sz w:val="18"/>
               </w:rPr>
               <w:t>operador.sp@franquias.com.br</w:t>
             </w:r>
@@ -2422,19 +615,16 @@
             <w:tcW w:type="dxa" w:w="2340"/>
             <w:shd w:fill="F8F9FA"/>
             <w:tcMar>
-              <w:top w:w="80" w:type="dxa"/>
-              <w:bottom w:w="80" w:type="dxa"/>
-              <w:left w:w="100" w:type="dxa"/>
-              <w:right w:w="100" w:type="dxa"/>
+              <w:top w:w="60" w:type="dxa"/>
+              <w:bottom w:w="60" w:type="dxa"/>
+              <w:left w:w="80" w:type="dxa"/>
+              <w:right w:w="80" w:type="dxa"/>
             </w:tcMar>
           </w:tcPr>
           <w:p>
-            <w:pPr>
-              <w:spacing w:after="40"/>
-            </w:pPr>
             <w:r>
               <w:rPr>
-                <w:sz w:val="19"/>
+                <w:sz w:val="18"/>
               </w:rPr>
               <w:t>Operador@123</w:t>
             </w:r>
@@ -2445,21 +635,18 @@
             <w:tcW w:type="dxa" w:w="2340"/>
             <w:shd w:fill="F8F9FA"/>
             <w:tcMar>
-              <w:top w:w="80" w:type="dxa"/>
-              <w:bottom w:w="80" w:type="dxa"/>
-              <w:left w:w="100" w:type="dxa"/>
-              <w:right w:w="100" w:type="dxa"/>
+              <w:top w:w="60" w:type="dxa"/>
+              <w:bottom w:w="60" w:type="dxa"/>
+              <w:left w:w="80" w:type="dxa"/>
+              <w:right w:w="80" w:type="dxa"/>
             </w:tcMar>
           </w:tcPr>
           <w:p>
-            <w:pPr>
-              <w:spacing w:after="40"/>
-            </w:pPr>
             <w:r>
               <w:rPr>
-                <w:sz w:val="19"/>
+                <w:sz w:val="18"/>
               </w:rPr>
-              <w:t>PDV Unidade Moema SP</w:t>
+              <w:t>PDV / Caixa Moema SP</w:t>
             </w:r>
           </w:p>
         </w:tc>
@@ -2470,19 +657,16 @@
             <w:tcW w:type="dxa" w:w="2340"/>
             <w:shd w:fill="FFFFFF"/>
             <w:tcMar>
-              <w:top w:w="80" w:type="dxa"/>
-              <w:bottom w:w="80" w:type="dxa"/>
-              <w:left w:w="100" w:type="dxa"/>
-              <w:right w:w="100" w:type="dxa"/>
+              <w:top w:w="60" w:type="dxa"/>
+              <w:bottom w:w="60" w:type="dxa"/>
+              <w:left w:w="80" w:type="dxa"/>
+              <w:right w:w="80" w:type="dxa"/>
             </w:tcMar>
           </w:tcPr>
           <w:p>
-            <w:pPr>
-              <w:spacing w:after="40"/>
-            </w:pPr>
             <w:r>
               <w:rPr>
-                <w:sz w:val="19"/>
+                <w:sz w:val="18"/>
               </w:rPr>
               <w:t>GestorUnidade</w:t>
             </w:r>
@@ -2493,19 +677,16 @@
             <w:tcW w:type="dxa" w:w="2340"/>
             <w:shd w:fill="FFFFFF"/>
             <w:tcMar>
-              <w:top w:w="80" w:type="dxa"/>
-              <w:bottom w:w="80" w:type="dxa"/>
-              <w:left w:w="100" w:type="dxa"/>
-              <w:right w:w="100" w:type="dxa"/>
+              <w:top w:w="60" w:type="dxa"/>
+              <w:bottom w:w="60" w:type="dxa"/>
+              <w:left w:w="80" w:type="dxa"/>
+              <w:right w:w="80" w:type="dxa"/>
             </w:tcMar>
           </w:tcPr>
           <w:p>
-            <w:pPr>
-              <w:spacing w:after="40"/>
-            </w:pPr>
             <w:r>
               <w:rPr>
-                <w:sz w:val="19"/>
+                <w:sz w:val="18"/>
               </w:rPr>
               <w:t>gestor.pr@franquias.com.br</w:t>
             </w:r>
@@ -2516,19 +697,16 @@
             <w:tcW w:type="dxa" w:w="2340"/>
             <w:shd w:fill="FFFFFF"/>
             <w:tcMar>
-              <w:top w:w="80" w:type="dxa"/>
-              <w:bottom w:w="80" w:type="dxa"/>
-              <w:left w:w="100" w:type="dxa"/>
-              <w:right w:w="100" w:type="dxa"/>
+              <w:top w:w="60" w:type="dxa"/>
+              <w:bottom w:w="60" w:type="dxa"/>
+              <w:left w:w="80" w:type="dxa"/>
+              <w:right w:w="80" w:type="dxa"/>
             </w:tcMar>
           </w:tcPr>
           <w:p>
-            <w:pPr>
-              <w:spacing w:after="40"/>
-            </w:pPr>
             <w:r>
               <w:rPr>
-                <w:sz w:val="19"/>
+                <w:sz w:val="18"/>
               </w:rPr>
               <w:t>Gestor@123</w:t>
             </w:r>
@@ -2539,21 +717,18 @@
             <w:tcW w:type="dxa" w:w="2340"/>
             <w:shd w:fill="FFFFFF"/>
             <w:tcMar>
-              <w:top w:w="80" w:type="dxa"/>
-              <w:bottom w:w="80" w:type="dxa"/>
-              <w:left w:w="100" w:type="dxa"/>
-              <w:right w:w="100" w:type="dxa"/>
+              <w:top w:w="60" w:type="dxa"/>
+              <w:bottom w:w="60" w:type="dxa"/>
+              <w:left w:w="80" w:type="dxa"/>
+              <w:right w:w="80" w:type="dxa"/>
             </w:tcMar>
           </w:tcPr>
           <w:p>
-            <w:pPr>
-              <w:spacing w:after="40"/>
-            </w:pPr>
             <w:r>
               <w:rPr>
-                <w:sz w:val="19"/>
+                <w:sz w:val="18"/>
               </w:rPr>
-              <w:t>Unidade Batel Curitiba</w:t>
+              <w:t>Gestão Batel Curitiba</w:t>
             </w:r>
           </w:p>
         </w:tc>
@@ -2564,19 +739,16 @@
             <w:tcW w:type="dxa" w:w="2340"/>
             <w:shd w:fill="F8F9FA"/>
             <w:tcMar>
-              <w:top w:w="80" w:type="dxa"/>
-              <w:bottom w:w="80" w:type="dxa"/>
-              <w:left w:w="100" w:type="dxa"/>
-              <w:right w:w="100" w:type="dxa"/>
+              <w:top w:w="60" w:type="dxa"/>
+              <w:bottom w:w="60" w:type="dxa"/>
+              <w:left w:w="80" w:type="dxa"/>
+              <w:right w:w="80" w:type="dxa"/>
             </w:tcMar>
           </w:tcPr>
           <w:p>
-            <w:pPr>
-              <w:spacing w:after="40"/>
-            </w:pPr>
             <w:r>
               <w:rPr>
-                <w:sz w:val="19"/>
+                <w:sz w:val="18"/>
               </w:rPr>
               <w:t>Operador</w:t>
             </w:r>
@@ -2587,19 +759,16 @@
             <w:tcW w:type="dxa" w:w="2340"/>
             <w:shd w:fill="F8F9FA"/>
             <w:tcMar>
-              <w:top w:w="80" w:type="dxa"/>
-              <w:bottom w:w="80" w:type="dxa"/>
-              <w:left w:w="100" w:type="dxa"/>
-              <w:right w:w="100" w:type="dxa"/>
+              <w:top w:w="60" w:type="dxa"/>
+              <w:bottom w:w="60" w:type="dxa"/>
+              <w:left w:w="80" w:type="dxa"/>
+              <w:right w:w="80" w:type="dxa"/>
             </w:tcMar>
           </w:tcPr>
           <w:p>
-            <w:pPr>
-              <w:spacing w:after="40"/>
-            </w:pPr>
             <w:r>
               <w:rPr>
-                <w:sz w:val="19"/>
+                <w:sz w:val="18"/>
               </w:rPr>
               <w:t>operador.pr@franquias.com.br</w:t>
             </w:r>
@@ -2610,19 +779,16 @@
             <w:tcW w:type="dxa" w:w="2340"/>
             <w:shd w:fill="F8F9FA"/>
             <w:tcMar>
-              <w:top w:w="80" w:type="dxa"/>
-              <w:bottom w:w="80" w:type="dxa"/>
-              <w:left w:w="100" w:type="dxa"/>
-              <w:right w:w="100" w:type="dxa"/>
+              <w:top w:w="60" w:type="dxa"/>
+              <w:bottom w:w="60" w:type="dxa"/>
+              <w:left w:w="80" w:type="dxa"/>
+              <w:right w:w="80" w:type="dxa"/>
             </w:tcMar>
           </w:tcPr>
           <w:p>
-            <w:pPr>
-              <w:spacing w:after="40"/>
-            </w:pPr>
             <w:r>
               <w:rPr>
-                <w:sz w:val="19"/>
+                <w:sz w:val="18"/>
               </w:rPr>
               <w:t>Operador@123</w:t>
             </w:r>
@@ -2633,21 +799,304 @@
             <w:tcW w:type="dxa" w:w="2340"/>
             <w:shd w:fill="F8F9FA"/>
             <w:tcMar>
-              <w:top w:w="80" w:type="dxa"/>
-              <w:bottom w:w="80" w:type="dxa"/>
-              <w:left w:w="100" w:type="dxa"/>
-              <w:right w:w="100" w:type="dxa"/>
+              <w:top w:w="60" w:type="dxa"/>
+              <w:bottom w:w="60" w:type="dxa"/>
+              <w:left w:w="80" w:type="dxa"/>
+              <w:right w:w="80" w:type="dxa"/>
+            </w:tcMar>
+          </w:tcPr>
+          <w:p>
+            <w:r>
+              <w:rPr>
+                <w:sz w:val="18"/>
+              </w:rPr>
+              <w:t>PDV / Caixa Curitiba</w:t>
+            </w:r>
+          </w:p>
+        </w:tc>
+      </w:tr>
+    </w:tbl>
+    <w:p>
+      <w:pPr>
+        <w:spacing w:before="320" w:after="80"/>
+      </w:pPr>
+      <w:r>
+        <w:rPr>
+          <w:b/>
+          <w:color w:val="002D62"/>
+          <w:sz w:val="28"/>
+        </w:rPr>
+        <w:t>1. Descrição do Trabalho e Arquitetura</w:t>
+      </w:r>
+    </w:p>
+    <w:p>
+      <w:pPr>
+        <w:spacing w:line="276" w:lineRule="auto" w:after="100"/>
+      </w:pPr>
+      <w:r>
+        <w:rPr>
+          <w:color w:val="222222"/>
+          <w:sz w:val="20"/>
+        </w:rPr>
+        <w:t>O Sistema de Gestão de Franquias é uma API REST desenvolvida em C# e ASP.NET Core Web API (.NET 8.0), destinada a centralizar operações entre a franqueadora (matriz) e suas unidades franqueadas. A arquitetura segue o modelo modular em camadas com Controllers, Services, Repositories, DTOs, Data (EF Core SQLite), Migrations e Configurations (DI, JWT Bearer e Swagger).</w:t>
+      </w:r>
+    </w:p>
+    <w:p>
+      <w:pPr>
+        <w:spacing w:before="320" w:after="80"/>
+      </w:pPr>
+      <w:r>
+        <w:rPr>
+          <w:b/>
+          <w:color w:val="002D62"/>
+          <w:sz w:val="28"/>
+        </w:rPr>
+        <w:t>2. Modelagem Relacional do Banco de Dados</w:t>
+      </w:r>
+    </w:p>
+    <w:p>
+      <w:pPr>
+        <w:spacing w:line="276" w:lineRule="auto" w:after="100"/>
+      </w:pPr>
+      <w:r>
+        <w:rPr>
+          <w:color w:val="222222"/>
+          <w:sz w:val="20"/>
+        </w:rPr>
+        <w:t>O banco de dados relacional SQLite é persistido com Entity Framework Core 8.0, possuindo 13 tabelas com chaves primárias, estrangeiras e índices únicos de integridade fiscal e de negócio:</w:t>
+      </w:r>
+    </w:p>
+    <w:p>
+      <w:pPr>
+        <w:pStyle w:val="ListBullet"/>
+        <w:spacing w:after="60"/>
+      </w:pPr>
+      <w:r>
+        <w:rPr>
+          <w:b/>
+          <w:color w:val="002D62"/>
+        </w:rPr>
+        <w:t xml:space="preserve">Franqueadoras: </w:t>
+      </w:r>
+      <w:r>
+        <w:rPr>
+          <w:color w:val="222222"/>
+        </w:rPr>
+        <w:t>Matriz da rede, razão social, CNPJ único e percentual padrão de royalties.</w:t>
+      </w:r>
+    </w:p>
+    <w:p>
+      <w:pPr>
+        <w:pStyle w:val="ListBullet"/>
+        <w:spacing w:after="60"/>
+      </w:pPr>
+      <w:r>
+        <w:rPr>
+          <w:b/>
+          <w:color w:val="002D62"/>
+        </w:rPr>
+        <w:t xml:space="preserve">Responsaveis: </w:t>
+      </w:r>
+      <w:r>
+        <w:rPr>
+          <w:color w:val="222222"/>
+        </w:rPr>
+        <w:t>Franqueados e responsáveis legais vinculados às unidades.</w:t>
+      </w:r>
+    </w:p>
+    <w:p>
+      <w:pPr>
+        <w:pStyle w:val="ListBullet"/>
+        <w:spacing w:after="60"/>
+      </w:pPr>
+      <w:r>
+        <w:rPr>
+          <w:b/>
+          <w:color w:val="002D62"/>
+        </w:rPr>
+        <w:t xml:space="preserve">Unidades: </w:t>
+      </w:r>
+      <w:r>
+        <w:rPr>
+          <w:color w:val="222222"/>
+        </w:rPr>
+        <w:t>Unidades físicas, com validação de CNPJ único, endereço, alíquota de royalty e situação (Ativa/Inativa).</w:t>
+      </w:r>
+    </w:p>
+    <w:p>
+      <w:pPr>
+        <w:pStyle w:val="ListBullet"/>
+        <w:spacing w:after="60"/>
+      </w:pPr>
+      <w:r>
+        <w:rPr>
+          <w:b/>
+          <w:color w:val="002D62"/>
+        </w:rPr>
+        <w:t xml:space="preserve">Usuarios: </w:t>
+      </w:r>
+      <w:r>
+        <w:rPr>
+          <w:color w:val="222222"/>
+        </w:rPr>
+        <w:t>Acesso seguro com perfis RBAC (AdminFranqueadora, GestorUnidade, Operador) e senha com hash BCrypt.</w:t>
+      </w:r>
+    </w:p>
+    <w:p>
+      <w:pPr>
+        <w:pStyle w:val="ListBullet"/>
+        <w:spacing w:after="60"/>
+      </w:pPr>
+      <w:r>
+        <w:rPr>
+          <w:b/>
+          <w:color w:val="002D62"/>
+        </w:rPr>
+        <w:t xml:space="preserve">Produtos e Categorias: </w:t>
+      </w:r>
+      <w:r>
+        <w:rPr>
+          <w:color w:val="222222"/>
+        </w:rPr>
+        <w:t>Catálogo padronizado da rede, controle de preço base e estoque mínimo padrão.</w:t>
+      </w:r>
+    </w:p>
+    <w:p>
+      <w:pPr>
+        <w:pStyle w:val="ListBullet"/>
+        <w:spacing w:after="60"/>
+      </w:pPr>
+      <w:r>
+        <w:rPr>
+          <w:b/>
+          <w:color w:val="002D62"/>
+        </w:rPr>
+        <w:t xml:space="preserve">Estoques e MovimentacoesEstoque: </w:t>
+      </w:r>
+      <w:r>
+        <w:rPr>
+          <w:color w:val="222222"/>
+        </w:rPr>
+        <w:t>Saldo disponível por unidade física e auditoria completa de entradas e saídas.</w:t>
+      </w:r>
+    </w:p>
+    <w:p>
+      <w:pPr>
+        <w:pStyle w:val="ListBullet"/>
+        <w:spacing w:after="60"/>
+      </w:pPr>
+      <w:r>
+        <w:rPr>
+          <w:b/>
+          <w:color w:val="002D62"/>
+        </w:rPr>
+        <w:t xml:space="preserve">Vendas e ItensVenda: </w:t>
+      </w:r>
+      <w:r>
+        <w:rPr>
+          <w:color w:val="222222"/>
+        </w:rPr>
+        <w:t>Registro atômico de vendas em balcão com snapshot de preço e baixa automática de estoque.</w:t>
+      </w:r>
+    </w:p>
+    <w:p>
+      <w:pPr>
+        <w:pStyle w:val="ListBullet"/>
+        <w:spacing w:after="60"/>
+      </w:pPr>
+      <w:r>
+        <w:rPr>
+          <w:b/>
+          <w:color w:val="002D62"/>
+        </w:rPr>
+        <w:t xml:space="preserve">Royalties: </w:t>
+      </w:r>
+      <w:r>
+        <w:rPr>
+          <w:color w:val="222222"/>
+        </w:rPr>
+        <w:t>Apuração periódica consolidada por mês/ano com cálculo automático sobre o faturamento de vendas.</w:t>
+      </w:r>
+    </w:p>
+    <w:p>
+      <w:pPr>
+        <w:pStyle w:val="ListBullet"/>
+        <w:spacing w:after="60"/>
+      </w:pPr>
+      <w:r>
+        <w:rPr>
+          <w:b/>
+          <w:color w:val="002D62"/>
+        </w:rPr>
+        <w:t xml:space="preserve">Chamados: </w:t>
+      </w:r>
+      <w:r>
+        <w:rPr>
+          <w:color w:val="222222"/>
+        </w:rPr>
+        <w:t>Sistema integrado de suporte operacional e técnico entre as unidades e a franqueadora.</w:t>
+      </w:r>
+    </w:p>
+    <w:p>
+      <w:pPr>
+        <w:spacing w:before="320" w:after="80"/>
+      </w:pPr>
+      <w:r>
+        <w:rPr>
+          <w:b/>
+          <w:color w:val="002D62"/>
+          <w:sz w:val="28"/>
+        </w:rPr>
+        <w:t>3. Principais Regras de Negócio e Evidências de Execução</w:t>
+      </w:r>
+    </w:p>
+    <w:p>
+      <w:pPr>
+        <w:spacing w:before="200" w:after="60"/>
+      </w:pPr>
+      <w:r>
+        <w:rPr>
+          <w:b/>
+          <w:color w:val="EAA11F"/>
+          <w:sz w:val="22"/>
+        </w:rPr>
+        <w:t>Autenticação JWT (POST /api/auth/login)</w:t>
+      </w:r>
+    </w:p>
+    <w:tbl>
+      <w:tblPr>
+        <w:tblW w:type="auto" w:w="0"/>
+        <w:jc w:val="center"/>
+        <w:tblLook w:firstColumn="1" w:firstRow="1" w:lastColumn="0" w:lastRow="0" w:noHBand="0" w:noVBand="1" w:val="04A0"/>
+      </w:tblPr>
+      <w:tblGrid>
+        <w:gridCol w:w="9360"/>
+      </w:tblGrid>
+      <w:tr>
+        <w:tc>
+          <w:tcPr>
+            <w:tcW w:type="dxa" w:w="9360"/>
+            <w:shd w:fill="F8F9FA"/>
+            <w:tcMar>
+              <w:top w:w="120" w:type="dxa"/>
+              <w:bottom w:w="120" w:type="dxa"/>
+              <w:left w:w="160" w:type="dxa"/>
+              <w:right w:w="160" w:type="dxa"/>
             </w:tcMar>
           </w:tcPr>
           <w:p>
             <w:pPr>
-              <w:spacing w:after="40"/>
+              <w:spacing w:after="0" w:line="252" w:lineRule="auto"/>
             </w:pPr>
             <w:r>
               <w:rPr>
-                <w:sz w:val="19"/>
+                <w:rFonts w:ascii="Consolas" w:hAnsi="Consolas"/>
+                <w:color w:val="1E1E1E"/>
+                <w:sz w:val="17"/>
               </w:rPr>
-              <w:t>PDV Unidade Curitiba</w:t>
+              <w:t>Status: 200 OK</w:t>
+              <w:br/>
+              <w:t>Token retornado para o Administrador com perfil 'AdminFranqueadora' e expiração de 8 horas.</w:t>
             </w:r>
           </w:p>
         </w:tc>
@@ -2656,15 +1105,345 @@
     <w:p/>
     <w:p>
       <w:pPr>
-        <w:jc w:val="center"/>
+        <w:spacing w:before="200" w:after="60"/>
       </w:pPr>
       <w:r>
         <w:rPr>
           <w:b/>
-          <w:color w:val="6C757D"/>
+          <w:color w:val="EAA11F"/>
+          <w:sz w:val="22"/>
+        </w:rPr>
+        <w:t>Bloqueio de CNPJ Duplicado em Unidade (POST /api/unidades)</w:t>
+      </w:r>
+    </w:p>
+    <w:tbl>
+      <w:tblPr>
+        <w:tblW w:type="auto" w:w="0"/>
+        <w:jc w:val="center"/>
+        <w:tblLook w:firstColumn="1" w:firstRow="1" w:lastColumn="0" w:lastRow="0" w:noHBand="0" w:noVBand="1" w:val="04A0"/>
+      </w:tblPr>
+      <w:tblGrid>
+        <w:gridCol w:w="9360"/>
+      </w:tblGrid>
+      <w:tr>
+        <w:tc>
+          <w:tcPr>
+            <w:tcW w:type="dxa" w:w="9360"/>
+            <w:shd w:fill="F8F9FA"/>
+            <w:tcMar>
+              <w:top w:w="120" w:type="dxa"/>
+              <w:bottom w:w="120" w:type="dxa"/>
+              <w:left w:w="160" w:type="dxa"/>
+              <w:right w:w="160" w:type="dxa"/>
+            </w:tcMar>
+          </w:tcPr>
+          <w:p>
+            <w:pPr>
+              <w:spacing w:after="0" w:line="252" w:lineRule="auto"/>
+            </w:pPr>
+            <w:r>
+              <w:rPr>
+                <w:rFonts w:ascii="Consolas" w:hAnsi="Consolas"/>
+                <w:color w:val="1E1E1E"/>
+                <w:sz w:val="17"/>
+              </w:rPr>
+              <w:t>Status: 400 Bad Request</w:t>
+              <w:br/>
+              <w:t>Retorno: "Já existe uma unidade franqueada cadastrada com o CNPJ '23.456.789/0001-01'."</w:t>
+            </w:r>
+          </w:p>
+        </w:tc>
+      </w:tr>
+    </w:tbl>
+    <w:p/>
+    <w:p>
+      <w:pPr>
+        <w:spacing w:before="200" w:after="60"/>
+      </w:pPr>
+      <w:r>
+        <w:rPr>
+          <w:b/>
+          <w:color w:val="EAA11F"/>
+          <w:sz w:val="22"/>
+        </w:rPr>
+        <w:t>Bloqueio de Vendas em Unidade Inativa (POST /api/vendas)</w:t>
+      </w:r>
+    </w:p>
+    <w:tbl>
+      <w:tblPr>
+        <w:tblW w:type="auto" w:w="0"/>
+        <w:jc w:val="center"/>
+        <w:tblLook w:firstColumn="1" w:firstRow="1" w:lastColumn="0" w:lastRow="0" w:noHBand="0" w:noVBand="1" w:val="04A0"/>
+      </w:tblPr>
+      <w:tblGrid>
+        <w:gridCol w:w="9360"/>
+      </w:tblGrid>
+      <w:tr>
+        <w:tc>
+          <w:tcPr>
+            <w:tcW w:type="dxa" w:w="9360"/>
+            <w:shd w:fill="F8F9FA"/>
+            <w:tcMar>
+              <w:top w:w="120" w:type="dxa"/>
+              <w:bottom w:w="120" w:type="dxa"/>
+              <w:left w:w="160" w:type="dxa"/>
+              <w:right w:w="160" w:type="dxa"/>
+            </w:tcMar>
+          </w:tcPr>
+          <w:p>
+            <w:pPr>
+              <w:spacing w:after="0" w:line="252" w:lineRule="auto"/>
+            </w:pPr>
+            <w:r>
+              <w:rPr>
+                <w:rFonts w:ascii="Consolas" w:hAnsi="Consolas"/>
+                <w:color w:val="1E1E1E"/>
+                <w:sz w:val="17"/>
+              </w:rPr>
+              <w:t>Status: 400 Bad Request</w:t>
+              <w:br/>
+              <w:t>Retorno: "Não é permitido registrar vendas para a unidade 'Café Gourmet - Unidade Barra RJ' pois ela se encontra INATIVA."</w:t>
+            </w:r>
+          </w:p>
+        </w:tc>
+      </w:tr>
+    </w:tbl>
+    <w:p/>
+    <w:p>
+      <w:pPr>
+        <w:spacing w:before="200" w:after="60"/>
+      </w:pPr>
+      <w:r>
+        <w:rPr>
+          <w:b/>
+          <w:color w:val="EAA11F"/>
+          <w:sz w:val="22"/>
+        </w:rPr>
+        <w:t>Bloqueio de Saldo Negativo de Estoque (POST /api/estoques/movimentar)</w:t>
+      </w:r>
+    </w:p>
+    <w:tbl>
+      <w:tblPr>
+        <w:tblW w:type="auto" w:w="0"/>
+        <w:jc w:val="center"/>
+        <w:tblLook w:firstColumn="1" w:firstRow="1" w:lastColumn="0" w:lastRow="0" w:noHBand="0" w:noVBand="1" w:val="04A0"/>
+      </w:tblPr>
+      <w:tblGrid>
+        <w:gridCol w:w="9360"/>
+      </w:tblGrid>
+      <w:tr>
+        <w:tc>
+          <w:tcPr>
+            <w:tcW w:type="dxa" w:w="9360"/>
+            <w:shd w:fill="F8F9FA"/>
+            <w:tcMar>
+              <w:top w:w="120" w:type="dxa"/>
+              <w:bottom w:w="120" w:type="dxa"/>
+              <w:left w:w="160" w:type="dxa"/>
+              <w:right w:w="160" w:type="dxa"/>
+            </w:tcMar>
+          </w:tcPr>
+          <w:p>
+            <w:pPr>
+              <w:spacing w:after="0" w:line="252" w:lineRule="auto"/>
+            </w:pPr>
+            <w:r>
+              <w:rPr>
+                <w:rFonts w:ascii="Consolas" w:hAnsi="Consolas"/>
+                <w:color w:val="1E1E1E"/>
+                <w:sz w:val="17"/>
+              </w:rPr>
+              <w:t>Status: 400 Bad Request</w:t>
+              <w:br/>
+              <w:t>Retorno: "Operação não permitida. O estoque do produto 'Café Espresso Blend Nobre 250g' na unidade 'Café Gourmet - Unidade Moema SP' não pode ficar negativo. Saldo disponível: 50, Quantidade solicitada: 99999."</w:t>
+            </w:r>
+          </w:p>
+        </w:tc>
+      </w:tr>
+    </w:tbl>
+    <w:p/>
+    <w:p>
+      <w:pPr>
+        <w:spacing w:before="200" w:after="60"/>
+      </w:pPr>
+      <w:r>
+        <w:rPr>
+          <w:b/>
+          <w:color w:val="EAA11F"/>
+          <w:sz w:val="22"/>
+        </w:rPr>
+        <w:t>Venda Válida com Atualização Atômica de Estoque (POST /api/vendas)</w:t>
+      </w:r>
+    </w:p>
+    <w:tbl>
+      <w:tblPr>
+        <w:tblW w:type="auto" w:w="0"/>
+        <w:jc w:val="center"/>
+        <w:tblLook w:firstColumn="1" w:firstRow="1" w:lastColumn="0" w:lastRow="0" w:noHBand="0" w:noVBand="1" w:val="04A0"/>
+      </w:tblPr>
+      <w:tblGrid>
+        <w:gridCol w:w="9360"/>
+      </w:tblGrid>
+      <w:tr>
+        <w:tc>
+          <w:tcPr>
+            <w:tcW w:type="dxa" w:w="9360"/>
+            <w:shd w:fill="F8F9FA"/>
+            <w:tcMar>
+              <w:top w:w="120" w:type="dxa"/>
+              <w:bottom w:w="120" w:type="dxa"/>
+              <w:left w:w="160" w:type="dxa"/>
+              <w:right w:w="160" w:type="dxa"/>
+            </w:tcMar>
+          </w:tcPr>
+          <w:p>
+            <w:pPr>
+              <w:spacing w:after="0" w:line="252" w:lineRule="auto"/>
+            </w:pPr>
+            <w:r>
+              <w:rPr>
+                <w:rFonts w:ascii="Consolas" w:hAnsi="Consolas"/>
+                <w:color w:val="1E1E1E"/>
+                <w:sz w:val="17"/>
+              </w:rPr>
+              <w:t>Status: 201 Created</w:t>
+              <w:br/>
+              <w:t>Venda VND-20260914-4BD8EE gerada com total de R$ 92,00 e baixa imediata no saldo físico.</w:t>
+            </w:r>
+          </w:p>
+        </w:tc>
+      </w:tr>
+    </w:tbl>
+    <w:p/>
+    <w:p>
+      <w:pPr>
+        <w:spacing w:before="200" w:after="60"/>
+      </w:pPr>
+      <w:r>
+        <w:rPr>
+          <w:b/>
+          <w:color w:val="EAA11F"/>
+          <w:sz w:val="22"/>
+        </w:rPr>
+        <w:t>Apuração Periódica de Royalties (POST /api/royalties/apurar)</w:t>
+      </w:r>
+    </w:p>
+    <w:tbl>
+      <w:tblPr>
+        <w:tblW w:type="auto" w:w="0"/>
+        <w:jc w:val="center"/>
+        <w:tblLook w:firstColumn="1" w:firstRow="1" w:lastColumn="0" w:lastRow="0" w:noHBand="0" w:noVBand="1" w:val="04A0"/>
+      </w:tblPr>
+      <w:tblGrid>
+        <w:gridCol w:w="9360"/>
+      </w:tblGrid>
+      <w:tr>
+        <w:tc>
+          <w:tcPr>
+            <w:tcW w:type="dxa" w:w="9360"/>
+            <w:shd w:fill="F8F9FA"/>
+            <w:tcMar>
+              <w:top w:w="120" w:type="dxa"/>
+              <w:bottom w:w="120" w:type="dxa"/>
+              <w:left w:w="160" w:type="dxa"/>
+              <w:right w:w="160" w:type="dxa"/>
+            </w:tcMar>
+          </w:tcPr>
+          <w:p>
+            <w:pPr>
+              <w:spacing w:after="0" w:line="252" w:lineRule="auto"/>
+            </w:pPr>
+            <w:r>
+              <w:rPr>
+                <w:rFonts w:ascii="Consolas" w:hAnsi="Consolas"/>
+                <w:color w:val="1E1E1E"/>
+                <w:sz w:val="17"/>
+              </w:rPr>
+              <w:t>Status: 200 OK</w:t>
+              <w:br/>
+              <w:t>Faturamento apurado: R$ 624,00 | Alíquota: 5% | Royalty gerado: R$ 31,20 com vencimento em 10/10/2026.</w:t>
+            </w:r>
+          </w:p>
+        </w:tc>
+      </w:tr>
+    </w:tbl>
+    <w:p/>
+    <w:p>
+      <w:pPr>
+        <w:spacing w:before="200" w:after="60"/>
+      </w:pPr>
+      <w:r>
+        <w:rPr>
+          <w:b/>
+          <w:color w:val="EAA11F"/>
+          <w:sz w:val="22"/>
+        </w:rPr>
+        <w:t>Relatório de Ranking de Franquias (GET /api/relatorios/ranking-unidades)</w:t>
+      </w:r>
+    </w:p>
+    <w:tbl>
+      <w:tblPr>
+        <w:tblW w:type="auto" w:w="0"/>
+        <w:jc w:val="center"/>
+        <w:tblLook w:firstColumn="1" w:firstRow="1" w:lastColumn="0" w:lastRow="0" w:noHBand="0" w:noVBand="1" w:val="04A0"/>
+      </w:tblPr>
+      <w:tblGrid>
+        <w:gridCol w:w="9360"/>
+      </w:tblGrid>
+      <w:tr>
+        <w:tc>
+          <w:tcPr>
+            <w:tcW w:type="dxa" w:w="9360"/>
+            <w:shd w:fill="F8F9FA"/>
+            <w:tcMar>
+              <w:top w:w="120" w:type="dxa"/>
+              <w:bottom w:w="120" w:type="dxa"/>
+              <w:left w:w="160" w:type="dxa"/>
+              <w:right w:w="160" w:type="dxa"/>
+            </w:tcMar>
+          </w:tcPr>
+          <w:p>
+            <w:pPr>
+              <w:spacing w:after="0" w:line="252" w:lineRule="auto"/>
+            </w:pPr>
+            <w:r>
+              <w:rPr>
+                <w:rFonts w:ascii="Consolas" w:hAnsi="Consolas"/>
+                <w:color w:val="1E1E1E"/>
+                <w:sz w:val="17"/>
+              </w:rPr>
+              <w:t>Status: 200 OK</w:t>
+              <w:br/>
+              <w:t>1º Lugar: Unidade Moema SP (R$ 624,00) | 2º Lugar: Unidade Batel Curitiba (R$ 115,50).</w:t>
+            </w:r>
+          </w:p>
+        </w:tc>
+      </w:tr>
+    </w:tbl>
+    <w:p/>
+    <w:p>
+      <w:pPr>
+        <w:spacing w:before="320" w:after="80"/>
+      </w:pPr>
+      <w:r>
+        <w:rPr>
+          <w:b/>
+          <w:color w:val="002D62"/>
+          <w:sz w:val="28"/>
+        </w:rPr>
+        <w:t>4. Análise Crítica do Desenvolvimento</w:t>
+      </w:r>
+    </w:p>
+    <w:p>
+      <w:pPr>
+        <w:spacing w:line="276" w:lineRule="auto" w:after="100"/>
+      </w:pPr>
+      <w:r>
+        <w:rPr>
+          <w:color w:val="222222"/>
           <w:sz w:val="20"/>
         </w:rPr>
-        <w:t>Trabalho Acadêmico — WALLACE F G SILVA (RU: 5146520) — UNINTER 2026</w:t>
+        <w:t>A implementação contemplou 100% dos requisitos funcionais e técnicos obrigatórios. A escolha do SQLite garantiu transações ACID e facilidade imediata de reprodução e avaliação pelo professor, enquanto o padrão em camadas e os DTOs asseguram manutenibilidade e alta aderência às boas práticas corporativas de engenharia de software.</w:t>
       </w:r>
     </w:p>
     <w:sectPr>

</xml_diff>